<commit_message>
Add at Nuclotron, Patr article and new article publ
</commit_message>
<xml_diff>
--- a/2025/6. RuPAC'25 СПб/Публикация RuPAC'25 Колокольчиков Figure-8.docx
+++ b/2025/6. RuPAC'25 СПб/Публикация RuPAC'25 Колокольчиков Figure-8.docx
@@ -1,6 +1,6 @@
 
 <file path=word/document.xml><?xml version="1.0" encoding="utf-8"?>
-<w:document xmlns:wpc="http://schemas.microsoft.com/office/word/2010/wordprocessingCanvas" xmlns:cx="http://schemas.microsoft.com/office/drawing/2014/chartex" xmlns:cx1="http://schemas.microsoft.com/office/drawing/2015/9/8/chartex" xmlns:cx2="http://schemas.microsoft.com/office/drawing/2015/10/21/chartex" xmlns:cx3="http://schemas.microsoft.com/office/drawing/2016/5/9/chartex" xmlns:cx4="http://schemas.microsoft.com/office/drawing/2016/5/10/chartex" xmlns:cx5="http://schemas.microsoft.com/office/drawing/2016/5/11/chartex" xmlns:cx6="http://schemas.microsoft.com/office/drawing/2016/5/12/chartex" xmlns:cx7="http://schemas.microsoft.com/office/drawing/2016/5/13/chartex" xmlns:cx8="http://schemas.microsoft.com/office/drawing/2016/5/14/chartex" xmlns:mc="http://schemas.openxmlformats.org/markup-compatibility/2006" xmlns:aink="http://schemas.microsoft.com/office/drawing/2016/ink" xmlns:am3d="http://schemas.microsoft.com/office/drawing/2017/model3d" xmlns:o="urn:schemas-microsoft-com:office:office" xmlns:r="http://schemas.openxmlformats.org/officeDocument/2006/relationships" xmlns:m="http://schemas.openxmlformats.org/officeDocument/2006/math" xmlns:v="urn:schemas-microsoft-com:vml" xmlns:wp14="http://schemas.microsoft.com/office/word/2010/wordprocessingDrawing" xmlns:wp="http://schemas.openxmlformats.org/drawingml/2006/wordprocessingDrawing" xmlns:w10="urn:schemas-microsoft-com:office:word" xmlns:w="http://schemas.openxmlformats.org/wordprocessingml/2006/main" xmlns:w14="http://schemas.microsoft.com/office/word/2010/wordml" xmlns:w15="http://schemas.microsoft.com/office/word/2012/wordml" xmlns:w16cex="http://schemas.microsoft.com/office/word/2018/wordml/cex" xmlns:w16cid="http://schemas.microsoft.com/office/word/2016/wordml/cid" xmlns:w16="http://schemas.microsoft.com/office/word/2018/wordml" xmlns:w16sdtdh="http://schemas.microsoft.com/office/word/2020/wordml/sdtdatahash" xmlns:w16se="http://schemas.microsoft.com/office/word/2015/wordml/symex" xmlns:wpg="http://schemas.microsoft.com/office/word/2010/wordprocessingGroup" xmlns:wpi="http://schemas.microsoft.com/office/word/2010/wordprocessingInk" xmlns:wne="http://schemas.microsoft.com/office/word/2006/wordml" xmlns:wps="http://schemas.microsoft.com/office/word/2010/wordprocessingShape" mc:Ignorable="w14 w15 w16se w16cid w16 w16cex w16sdtdh wp14">
+<w:document xmlns:wpc="http://schemas.microsoft.com/office/word/2010/wordprocessingCanvas" xmlns:cx="http://schemas.microsoft.com/office/drawing/2014/chartex" xmlns:cx1="http://schemas.microsoft.com/office/drawing/2015/9/8/chartex" xmlns:cx2="http://schemas.microsoft.com/office/drawing/2015/10/21/chartex" xmlns:cx3="http://schemas.microsoft.com/office/drawing/2016/5/9/chartex" xmlns:cx4="http://schemas.microsoft.com/office/drawing/2016/5/10/chartex" xmlns:cx5="http://schemas.microsoft.com/office/drawing/2016/5/11/chartex" xmlns:cx6="http://schemas.microsoft.com/office/drawing/2016/5/12/chartex" xmlns:cx7="http://schemas.microsoft.com/office/drawing/2016/5/13/chartex" xmlns:cx8="http://schemas.microsoft.com/office/drawing/2016/5/14/chartex" xmlns:mc="http://schemas.openxmlformats.org/markup-compatibility/2006" xmlns:aink="http://schemas.microsoft.com/office/drawing/2016/ink" xmlns:am3d="http://schemas.microsoft.com/office/drawing/2017/model3d" xmlns:o="urn:schemas-microsoft-com:office:office" xmlns:oel="http://schemas.microsoft.com/office/2019/extlst" xmlns:r="http://schemas.openxmlformats.org/officeDocument/2006/relationships" xmlns:m="http://schemas.openxmlformats.org/officeDocument/2006/math" xmlns:v="urn:schemas-microsoft-com:vml" xmlns:wp14="http://schemas.microsoft.com/office/word/2010/wordprocessingDrawing" xmlns:wp="http://schemas.openxmlformats.org/drawingml/2006/wordprocessingDrawing" xmlns:w10="urn:schemas-microsoft-com:office:word" xmlns:w="http://schemas.openxmlformats.org/wordprocessingml/2006/main" xmlns:w14="http://schemas.microsoft.com/office/word/2010/wordml" xmlns:w15="http://schemas.microsoft.com/office/word/2012/wordml" xmlns:w16cex="http://schemas.microsoft.com/office/word/2018/wordml/cex" xmlns:w16cid="http://schemas.microsoft.com/office/word/2016/wordml/cid" xmlns:w16="http://schemas.microsoft.com/office/word/2018/wordml" xmlns:w16sdtdh="http://schemas.microsoft.com/office/word/2020/wordml/sdtdatahash" xmlns:w16se="http://schemas.microsoft.com/office/word/2015/wordml/symex" xmlns:wpg="http://schemas.microsoft.com/office/word/2010/wordprocessingGroup" xmlns:wpi="http://schemas.microsoft.com/office/word/2010/wordprocessingInk" xmlns:wne="http://schemas.microsoft.com/office/word/2006/wordml" xmlns:wps="http://schemas.microsoft.com/office/word/2010/wordprocessingShape" mc:Ignorable="w14 w15 w16se w16cid w16 w16cex w16sdtdh wp14">
   <w:body>
     <w:p>
       <w:pPr>
@@ -257,6 +257,7 @@
       <w:pPr>
         <w:pStyle w:val="1"/>
         <w:spacing w:line="360" w:lineRule="auto"/>
+        <w:jc w:val="both"/>
         <w:rPr>
           <w:rFonts w:ascii="Times New Roman" w:hAnsi="Times New Roman" w:cs="Times New Roman"/>
         </w:rPr>
@@ -276,7 +277,13 @@
         <w:jc w:val="both"/>
       </w:pPr>
       <w:r>
-        <w:t>Ускорение поляризованного пучка представляет большой интерес для коллайдерных экспериментов. При этом возникает проблема пересечения различного рода спиновых резонансов, приводящих к деполяризации пучка. При использовании кольца в форме восьмерки одна арка компенсирует прецессию спина под действием Магнитного Дипольного Момента (МДМ), вызванную другой. Таким образом, частота вращения спина (</w:t>
+        <w:t xml:space="preserve">Ускорение поляризованного пучка представляет большой интерес для коллайдерных экспериментов. При этом возникает проблема пересечения различного рода спиновых резонансов, приводящих к деполяризации пучка. При использовании кольца в форме </w:t>
+      </w:r>
+      <w:r>
+        <w:t>8</w:t>
+      </w:r>
+      <w:r>
+        <w:t xml:space="preserve"> одна арка компенсирует прецессию спина под действием Магнитного Дипольного Момента (МДМ), вызванную другой. Таким образом, частота вращения спина (</w:t>
       </w:r>
       <w:r>
         <w:rPr>
@@ -339,7 +346,19 @@
         <w:jc w:val="both"/>
       </w:pPr>
       <w:r>
-        <w:t>Для поляризованных протонных пучков возникает задача по преодолению критической энергии. Для решения этой проблемы применяется метод вариации дисперсионной функции [2]. Таким образом, критическая энергия поднимается выше энергии эксперимента или даже достигать комплексного значения.</w:t>
+        <w:t xml:space="preserve">Для поляризованных протонных пучков возникает задача по преодолению критической энергии. Для решения этой проблемы применяется метод вариации дисперсионной функции [2]. Таким образом, критическая энергия поднимается выше энергии эксперимента </w:t>
+      </w:r>
+      <w:r>
+        <w:t>и</w:t>
+      </w:r>
+      <w:r>
+        <w:t xml:space="preserve"> даже</w:t>
+      </w:r>
+      <w:r>
+        <w:t xml:space="preserve"> может</w:t>
+      </w:r>
+      <w:r>
+        <w:t xml:space="preserve"> достигать комплексного значения.</w:t>
       </w:r>
     </w:p>
     <w:p>
@@ -362,14 +381,22 @@
       </w:pPr>
       <w:r>
         <w:lastRenderedPageBreak/>
-        <w:tab/>
-        <w:t>Применение структуры также возможно для тяжелоионного пучка, при этом ключевым требованием является достижение высокого времени жизни пучка. Для этого влияние внутрипучкового рассеяния (ВПР) должно быть скомпенсировано электронным и стохастическим охлаждением, что эффективно может быть получено в структуре с минимально модулированными Твисс-функциями.</w:t>
+        <w:t xml:space="preserve">Применение структуры также возможно для тяжелоионного пучка, при этом ключевым требованием является достижение высокого времени жизни пучка. Для этого влияние внутрипучкового рассеяния (ВПР) должно быть скомпенсировано электронным и стохастическим охлаждением, что эффективно может быть получено в структуре с минимально модулированными </w:t>
+      </w:r>
+      <w:proofErr w:type="spellStart"/>
+      <w:r>
+        <w:t>Твисс</w:t>
+      </w:r>
+      <w:proofErr w:type="spellEnd"/>
+      <w:r>
+        <w:t>-функциями.</w:t>
       </w:r>
     </w:p>
     <w:p>
       <w:pPr>
         <w:pStyle w:val="1"/>
         <w:spacing w:line="360" w:lineRule="auto"/>
+        <w:jc w:val="both"/>
         <w:rPr>
           <w:rFonts w:ascii="Times New Roman" w:hAnsi="Times New Roman" w:cs="Times New Roman"/>
         </w:rPr>
@@ -435,7 +462,21 @@
         <w:rPr>
           <w:rFonts w:ascii="Times New Roman" w:hAnsi="Times New Roman" w:cs="Times New Roman"/>
         </w:rPr>
-        <w:t xml:space="preserve">относительно частотой (спин-тюн) </w:t>
+        <w:t>относительно частотой (спин-</w:t>
+      </w:r>
+      <w:proofErr w:type="spellStart"/>
+      <w:r>
+        <w:rPr>
+          <w:rFonts w:ascii="Times New Roman" w:hAnsi="Times New Roman" w:cs="Times New Roman"/>
+        </w:rPr>
+        <w:t>тюн</w:t>
+      </w:r>
+      <w:proofErr w:type="spellEnd"/>
+      <w:r>
+        <w:rPr>
+          <w:rFonts w:ascii="Times New Roman" w:hAnsi="Times New Roman" w:cs="Times New Roman"/>
+        </w:rPr>
+        <w:t xml:space="preserve">) </w:t>
       </w:r>
       <m:oMath>
         <m:sSub>
@@ -737,7 +778,37 @@
         <w:rPr>
           <w:rFonts w:ascii="Times New Roman" w:eastAsiaTheme="minorEastAsia" w:hAnsi="Times New Roman" w:cs="Times New Roman"/>
         </w:rPr>
-        <w:t xml:space="preserve"> пропорционален интегралу по кольцу</w:t>
+        <w:t xml:space="preserve"> пропорционал</w:t>
+      </w:r>
+      <w:r>
+        <w:rPr>
+          <w:rFonts w:ascii="Times New Roman" w:eastAsiaTheme="minorEastAsia" w:hAnsi="Times New Roman" w:cs="Times New Roman"/>
+        </w:rPr>
+        <w:t>ьно</w:t>
+      </w:r>
+      <w:r>
+        <w:rPr>
+          <w:rFonts w:ascii="Times New Roman" w:eastAsiaTheme="minorEastAsia" w:hAnsi="Times New Roman" w:cs="Times New Roman"/>
+        </w:rPr>
+        <w:t xml:space="preserve"> интегралу по</w:t>
+      </w:r>
+      <w:r>
+        <w:rPr>
+          <w:rFonts w:ascii="Times New Roman" w:eastAsiaTheme="minorEastAsia" w:hAnsi="Times New Roman" w:cs="Times New Roman"/>
+        </w:rPr>
+        <w:t xml:space="preserve"> длине</w:t>
+      </w:r>
+      <w:r>
+        <w:rPr>
+          <w:rFonts w:ascii="Times New Roman" w:eastAsiaTheme="minorEastAsia" w:hAnsi="Times New Roman" w:cs="Times New Roman"/>
+        </w:rPr>
+        <w:t xml:space="preserve"> кольц</w:t>
+      </w:r>
+      <w:r>
+        <w:rPr>
+          <w:rFonts w:ascii="Times New Roman" w:eastAsiaTheme="minorEastAsia" w:hAnsi="Times New Roman" w:cs="Times New Roman"/>
+        </w:rPr>
+        <w:t>а</w:t>
       </w:r>
     </w:p>
     <w:p>
@@ -1206,7 +1277,19 @@
         <w:rPr>
           <w:rFonts w:ascii="Times New Roman" w:eastAsiaTheme="minorEastAsia" w:hAnsi="Times New Roman" w:cs="Times New Roman"/>
         </w:rPr>
-        <w:t xml:space="preserve"> при суперпериодической модуляции градиента в первом порядке даётся уравнением</w:t>
+        <w:t xml:space="preserve"> при суперпериодической модуляции градиента</w:t>
+      </w:r>
+      <w:r>
+        <w:rPr>
+          <w:rFonts w:ascii="Times New Roman" w:eastAsiaTheme="minorEastAsia" w:hAnsi="Times New Roman" w:cs="Times New Roman"/>
+        </w:rPr>
+        <w:t xml:space="preserve"> квадрупольных линз</w:t>
+      </w:r>
+      <w:r>
+        <w:rPr>
+          <w:rFonts w:ascii="Times New Roman" w:eastAsiaTheme="minorEastAsia" w:hAnsi="Times New Roman" w:cs="Times New Roman"/>
+        </w:rPr>
+        <w:t xml:space="preserve"> в первом порядке даётся уравнением</w:t>
       </w:r>
     </w:p>
     <w:p>
@@ -1656,8 +1739,6 @@
         <w:jc w:val="both"/>
         <w:rPr>
           <w:rFonts w:ascii="Times New Roman" w:eastAsiaTheme="minorEastAsia" w:hAnsi="Times New Roman" w:cs="Times New Roman"/>
-          <w:b/>
-          <w:bCs/>
         </w:rPr>
       </w:pPr>
       <w:r>
@@ -1951,35 +2032,8 @@
         <w:rPr>
           <w:rFonts w:ascii="Times New Roman" w:eastAsiaTheme="minorEastAsia" w:hAnsi="Times New Roman" w:cs="Times New Roman"/>
         </w:rPr>
-        <w:t xml:space="preserve">второго суперпериода подавляются третьим/четвертым в силу набега фазы </w:t>
-      </w:r>
-      <m:oMath>
-        <m:r>
-          <m:rPr>
-            <m:sty m:val="p"/>
-          </m:rPr>
-          <w:rPr>
-            <w:rFonts w:ascii="Cambria Math" w:eastAsiaTheme="minorEastAsia" w:hAnsi="Cambria Math" w:cs="Times New Roman"/>
-          </w:rPr>
-          <m:t>π</m:t>
-        </m:r>
-      </m:oMath>
-      <w:r>
-        <w:rPr>
-          <w:rFonts w:ascii="Times New Roman" w:eastAsiaTheme="minorEastAsia" w:hAnsi="Times New Roman" w:cs="Times New Roman"/>
-        </w:rPr>
-        <w:t>.</w:t>
-      </w:r>
-    </w:p>
-    <w:p>
-      <w:pPr>
-        <w:spacing w:line="360" w:lineRule="auto"/>
-        <w:ind w:firstLine="708"/>
-        <w:jc w:val="both"/>
-        <w:rPr>
-          <w:rFonts w:ascii="Times New Roman" w:eastAsiaTheme="minorEastAsia" w:hAnsi="Times New Roman" w:cs="Times New Roman"/>
-        </w:rPr>
-      </w:pPr>
+        <w:t xml:space="preserve">второго суперпериода подавляются </w:t>
+      </w:r>
       <w:r>
         <w:rPr>
           <w:noProof/>
@@ -1987,22 +2041,22 @@
         <mc:AlternateContent>
           <mc:Choice Requires="wps">
             <w:drawing>
-              <wp:anchor distT="0" distB="0" distL="114300" distR="114300" simplePos="0" relativeHeight="251662336" behindDoc="1" locked="0" layoutInCell="1" allowOverlap="1" wp14:anchorId="277D50C1" wp14:editId="46055538">
+              <wp:anchor distT="0" distB="0" distL="114300" distR="114300" simplePos="0" relativeHeight="251662336" behindDoc="1" locked="0" layoutInCell="1" allowOverlap="1" wp14:anchorId="277D50C1" wp14:editId="47DBAA74">
                 <wp:simplePos x="0" y="0"/>
                 <wp:positionH relativeFrom="column">
-                  <wp:posOffset>1905</wp:posOffset>
+                  <wp:posOffset>635</wp:posOffset>
                 </wp:positionH>
                 <wp:positionV relativeFrom="paragraph">
-                  <wp:posOffset>2245360</wp:posOffset>
+                  <wp:posOffset>1903730</wp:posOffset>
                 </wp:positionV>
-                <wp:extent cx="5905500" cy="635"/>
+                <wp:extent cx="5943600" cy="635"/>
                 <wp:effectExtent l="0" t="0" r="0" b="0"/>
                 <wp:wrapTight wrapText="bothSides">
                   <wp:wrapPolygon edited="0">
                     <wp:start x="0" y="0"/>
-                    <wp:lineTo x="0" y="20057"/>
-                    <wp:lineTo x="21530" y="20057"/>
-                    <wp:lineTo x="21530" y="0"/>
+                    <wp:lineTo x="0" y="20571"/>
+                    <wp:lineTo x="21554" y="20571"/>
+                    <wp:lineTo x="21554" y="0"/>
                     <wp:lineTo x="0" y="0"/>
                   </wp:wrapPolygon>
                 </wp:wrapTight>
@@ -2015,7 +2069,7 @@
                       <wps:spPr>
                         <a:xfrm>
                           <a:off x="0" y="0"/>
-                          <a:ext cx="5905500" cy="635"/>
+                          <a:ext cx="5943600" cy="635"/>
                         </a:xfrm>
                         <a:prstGeom prst="rect">
                           <a:avLst/>
@@ -2035,7 +2089,6 @@
                               <w:rPr>
                                 <w:rFonts w:ascii="Times New Roman" w:hAnsi="Times New Roman" w:cs="Times New Roman"/>
                                 <w:noProof/>
-                                <w:lang w:val="en-US"/>
                               </w:rPr>
                             </w:pPr>
                             <w:r>
@@ -2088,7 +2141,7 @@
                 <v:stroke joinstyle="miter"/>
                 <v:path gradientshapeok="t" o:connecttype="rect"/>
               </v:shapetype>
-              <v:shape id="Надпись 4" o:spid="_x0000_s1026" type="#_x0000_t202" style="position:absolute;left:0;text-align:left;margin-left:.15pt;margin-top:176.8pt;width:465pt;height:.05pt;z-index:-251654144;visibility:visible;mso-wrap-style:square;mso-width-percent:0;mso-wrap-distance-left:9pt;mso-wrap-distance-top:0;mso-wrap-distance-right:9pt;mso-wrap-distance-bottom:0;mso-position-horizontal:absolute;mso-position-horizontal-relative:text;mso-position-vertical:absolute;mso-position-vertical-relative:text;mso-width-percent:0;mso-width-relative:margin;v-text-anchor:top" o:gfxdata="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" stroked="f">
+              <v:shape id="Надпись 4" o:spid="_x0000_s1026" type="#_x0000_t202" style="position:absolute;left:0;text-align:left;margin-left:.05pt;margin-top:149.9pt;width:468pt;height:.05pt;z-index:-251654144;visibility:visible;mso-wrap-style:square;mso-width-percent:0;mso-wrap-distance-left:9pt;mso-wrap-distance-top:0;mso-wrap-distance-right:9pt;mso-wrap-distance-bottom:0;mso-position-horizontal:absolute;mso-position-horizontal-relative:text;mso-position-vertical:absolute;mso-position-vertical-relative:text;mso-width-percent:0;mso-width-relative:margin;v-text-anchor:top" o:gfxdata="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" stroked="f">
                 <v:textbox style="mso-fit-shape-to-text:t" inset="0,0,0,0">
                   <w:txbxContent>
                     <w:p>
@@ -2097,7 +2150,6 @@
                         <w:rPr>
                           <w:rFonts w:ascii="Times New Roman" w:hAnsi="Times New Roman" w:cs="Times New Roman"/>
                           <w:noProof/>
-                          <w:lang w:val="en-US"/>
                         </w:rPr>
                       </w:pPr>
                       <w:r>
@@ -2137,25 +2189,224 @@
       </w:r>
       <w:r>
         <w:rPr>
-          <w:rFonts w:ascii="Times New Roman" w:hAnsi="Times New Roman" w:cs="Times New Roman"/>
           <w:noProof/>
         </w:rPr>
+        <mc:AlternateContent>
+          <mc:Choice Requires="wps">
+            <w:drawing>
+              <wp:anchor distT="0" distB="0" distL="114300" distR="114300" simplePos="0" relativeHeight="251667456" behindDoc="0" locked="0" layoutInCell="1" allowOverlap="1" wp14:anchorId="240A70E4" wp14:editId="487EB1F8">
+                <wp:simplePos x="0" y="0"/>
+                <wp:positionH relativeFrom="column">
+                  <wp:posOffset>635</wp:posOffset>
+                </wp:positionH>
+                <wp:positionV relativeFrom="paragraph">
+                  <wp:posOffset>3342640</wp:posOffset>
+                </wp:positionV>
+                <wp:extent cx="5943600" cy="635"/>
+                <wp:effectExtent l="0" t="0" r="0" b="0"/>
+                <wp:wrapTopAndBottom/>
+                <wp:docPr id="1431886084" name="Надпись 1"/>
+                <wp:cNvGraphicFramePr/>
+                <a:graphic xmlns:a="http://schemas.openxmlformats.org/drawingml/2006/main">
+                  <a:graphicData uri="http://schemas.microsoft.com/office/word/2010/wordprocessingShape">
+                    <wps:wsp>
+                      <wps:cNvSpPr txBox="1"/>
+                      <wps:spPr>
+                        <a:xfrm>
+                          <a:off x="0" y="0"/>
+                          <a:ext cx="5943600" cy="635"/>
+                        </a:xfrm>
+                        <a:prstGeom prst="rect">
+                          <a:avLst/>
+                        </a:prstGeom>
+                        <a:solidFill>
+                          <a:prstClr val="white"/>
+                        </a:solidFill>
+                        <a:ln>
+                          <a:noFill/>
+                        </a:ln>
+                      </wps:spPr>
+                      <wps:txbx>
+                        <w:txbxContent>
+                          <w:p>
+                            <w:pPr>
+                              <w:pStyle w:val="a7"/>
+                              <w:rPr>
+                                <w:rFonts w:ascii="Times New Roman" w:hAnsi="Times New Roman" w:cs="Times New Roman"/>
+                                <w:b/>
+                                <w:bCs/>
+                                <w:noProof/>
+                                <w:sz w:val="22"/>
+                                <w:szCs w:val="22"/>
+                                <w14:ligatures w14:val="none"/>
+                              </w:rPr>
+                            </w:pPr>
+                            <w:r>
+                              <w:t xml:space="preserve">Рис. </w:t>
+                            </w:r>
+                            <w:r>
+                              <w:t>2 Принципиальная</w:t>
+                            </w:r>
+                            <w:r>
+                              <w:t xml:space="preserve"> </w:t>
+                            </w:r>
+                            <w:r>
+                              <w:t>схема поворотной арки, состоящей из 12 ячеек, сформированных в 4 суперпериода</w:t>
+                            </w:r>
+                          </w:p>
+                        </w:txbxContent>
+                      </wps:txbx>
+                      <wps:bodyPr rot="0" spcFirstLastPara="0" vertOverflow="overflow" horzOverflow="overflow" vert="horz" wrap="square" lIns="0" tIns="0" rIns="0" bIns="0" numCol="1" spcCol="0" rtlCol="0" fromWordArt="0" anchor="t" anchorCtr="0" forceAA="0" compatLnSpc="1">
+                        <a:prstTxWarp prst="textNoShape">
+                          <a:avLst/>
+                        </a:prstTxWarp>
+                        <a:spAutoFit/>
+                      </wps:bodyPr>
+                    </wps:wsp>
+                  </a:graphicData>
+                </a:graphic>
+                <wp14:sizeRelH relativeFrom="margin">
+                  <wp14:pctWidth>0</wp14:pctWidth>
+                </wp14:sizeRelH>
+              </wp:anchor>
+            </w:drawing>
+          </mc:Choice>
+          <mc:Fallback>
+            <w:pict>
+              <v:shape w14:anchorId="240A70E4" id="Надпись 1" o:spid="_x0000_s1027" type="#_x0000_t202" style="position:absolute;left:0;text-align:left;margin-left:.05pt;margin-top:263.2pt;width:468pt;height:.05pt;z-index:251667456;visibility:visible;mso-wrap-style:square;mso-width-percent:0;mso-wrap-distance-left:9pt;mso-wrap-distance-top:0;mso-wrap-distance-right:9pt;mso-wrap-distance-bottom:0;mso-position-horizontal:absolute;mso-position-horizontal-relative:text;mso-position-vertical:absolute;mso-position-vertical-relative:text;mso-width-percent:0;mso-width-relative:margin;v-text-anchor:top" o:gfxdata="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" stroked="f">
+                <v:textbox style="mso-fit-shape-to-text:t" inset="0,0,0,0">
+                  <w:txbxContent>
+                    <w:p>
+                      <w:pPr>
+                        <w:pStyle w:val="a7"/>
+                        <w:rPr>
+                          <w:rFonts w:ascii="Times New Roman" w:hAnsi="Times New Roman" w:cs="Times New Roman"/>
+                          <w:b/>
+                          <w:bCs/>
+                          <w:noProof/>
+                          <w:sz w:val="22"/>
+                          <w:szCs w:val="22"/>
+                          <w14:ligatures w14:val="none"/>
+                        </w:rPr>
+                      </w:pPr>
+                      <w:r>
+                        <w:t xml:space="preserve">Рис. </w:t>
+                      </w:r>
+                      <w:r>
+                        <w:t>2 Принципиальная</w:t>
+                      </w:r>
+                      <w:r>
+                        <w:t xml:space="preserve"> </w:t>
+                      </w:r>
+                      <w:r>
+                        <w:t>схема поворотной арки, состоящей из 12 ячеек, сформированных в 4 суперпериода</w:t>
+                      </w:r>
+                    </w:p>
+                  </w:txbxContent>
+                </v:textbox>
+                <w10:wrap type="topAndBottom"/>
+              </v:shape>
+            </w:pict>
+          </mc:Fallback>
+        </mc:AlternateContent>
+      </w:r>
+      <w:r>
+        <w:rPr>
+          <w:rFonts w:ascii="Times New Roman" w:eastAsiaTheme="minorEastAsia" w:hAnsi="Times New Roman" w:cs="Times New Roman"/>
+          <w:noProof/>
+        </w:rPr>
         <w:drawing>
-          <wp:anchor distT="0" distB="0" distL="114300" distR="114300" simplePos="0" relativeHeight="251660288" behindDoc="0" locked="0" layoutInCell="1" allowOverlap="1" wp14:anchorId="52C09436" wp14:editId="6FEA2DBE">
+          <wp:anchor distT="0" distB="0" distL="114300" distR="114300" simplePos="0" relativeHeight="251659264" behindDoc="0" locked="0" layoutInCell="1" allowOverlap="1" wp14:anchorId="4027560B" wp14:editId="2C6591F5">
+            <wp:simplePos x="0" y="0"/>
+            <wp:positionH relativeFrom="column">
+              <wp:posOffset>3465195</wp:posOffset>
+            </wp:positionH>
+            <wp:positionV relativeFrom="paragraph">
+              <wp:posOffset>780415</wp:posOffset>
+            </wp:positionV>
+            <wp:extent cx="2477135" cy="1061720"/>
+            <wp:effectExtent l="0" t="0" r="0" b="5080"/>
+            <wp:wrapThrough wrapText="bothSides">
+              <wp:wrapPolygon edited="0">
+                <wp:start x="0" y="0"/>
+                <wp:lineTo x="0" y="21445"/>
+                <wp:lineTo x="21484" y="21445"/>
+                <wp:lineTo x="21484" y="0"/>
+                <wp:lineTo x="0" y="0"/>
+              </wp:wrapPolygon>
+            </wp:wrapThrough>
+            <wp:docPr id="5" name="Рисунок 5"/>
+            <wp:cNvGraphicFramePr>
+              <a:graphicFrameLocks xmlns:a="http://schemas.openxmlformats.org/drawingml/2006/main" noChangeAspect="1"/>
+            </wp:cNvGraphicFramePr>
+            <a:graphic xmlns:a="http://schemas.openxmlformats.org/drawingml/2006/main">
+              <a:graphicData uri="http://schemas.openxmlformats.org/drawingml/2006/picture">
+                <pic:pic xmlns:pic="http://schemas.openxmlformats.org/drawingml/2006/picture">
+                  <pic:nvPicPr>
+                    <pic:cNvPr id="0" name="Picture 2"/>
+                    <pic:cNvPicPr>
+                      <a:picLocks noChangeAspect="1" noChangeArrowheads="1"/>
+                    </pic:cNvPicPr>
+                  </pic:nvPicPr>
+                  <pic:blipFill>
+                    <a:blip r:embed="rId6">
+                      <a:extLst>
+                        <a:ext uri="{28A0092B-C50C-407E-A947-70E740481C1C}">
+                          <a14:useLocalDpi xmlns:a14="http://schemas.microsoft.com/office/drawing/2010/main" val="0"/>
+                        </a:ext>
+                      </a:extLst>
+                    </a:blip>
+                    <a:srcRect/>
+                    <a:stretch>
+                      <a:fillRect/>
+                    </a:stretch>
+                  </pic:blipFill>
+                  <pic:spPr bwMode="auto">
+                    <a:xfrm>
+                      <a:off x="0" y="0"/>
+                      <a:ext cx="2477135" cy="1061720"/>
+                    </a:xfrm>
+                    <a:prstGeom prst="rect">
+                      <a:avLst/>
+                    </a:prstGeom>
+                    <a:noFill/>
+                    <a:ln>
+                      <a:noFill/>
+                    </a:ln>
+                  </pic:spPr>
+                </pic:pic>
+              </a:graphicData>
+            </a:graphic>
+            <wp14:sizeRelH relativeFrom="page">
+              <wp14:pctWidth>0</wp14:pctWidth>
+            </wp14:sizeRelH>
+            <wp14:sizeRelV relativeFrom="page">
+              <wp14:pctHeight>0</wp14:pctHeight>
+            </wp14:sizeRelV>
+          </wp:anchor>
+        </w:drawing>
+      </w:r>
+      <w:r>
+        <w:rPr>
+          <w:rFonts w:ascii="Times New Roman" w:hAnsi="Times New Roman" w:cs="Times New Roman"/>
+          <w:noProof/>
+        </w:rPr>
+        <w:drawing>
+          <wp:anchor distT="0" distB="0" distL="114300" distR="114300" simplePos="0" relativeHeight="251660288" behindDoc="0" locked="0" layoutInCell="1" allowOverlap="1" wp14:anchorId="52C09436" wp14:editId="4C804926">
             <wp:simplePos x="0" y="0"/>
             <wp:positionH relativeFrom="column">
               <wp:posOffset>0</wp:posOffset>
             </wp:positionH>
             <wp:positionV relativeFrom="paragraph">
-              <wp:posOffset>1123950</wp:posOffset>
+              <wp:posOffset>781050</wp:posOffset>
             </wp:positionV>
             <wp:extent cx="3408045" cy="1061720"/>
-            <wp:effectExtent l="0" t="0" r="1905" b="5080"/>
+            <wp:effectExtent l="0" t="0" r="0" b="5080"/>
             <wp:wrapThrough wrapText="bothSides">
               <wp:wrapPolygon edited="0">
                 <wp:start x="0" y="0"/>
-                <wp:lineTo x="0" y="21316"/>
-                <wp:lineTo x="21491" y="21316"/>
+                <wp:lineTo x="0" y="21445"/>
+                <wp:lineTo x="21491" y="21445"/>
                 <wp:lineTo x="21491" y="0"/>
                 <wp:lineTo x="0" y="0"/>
               </wp:wrapPolygon>
@@ -2174,7 +2425,7 @@
                     </pic:cNvPicPr>
                   </pic:nvPicPr>
                   <pic:blipFill>
-                    <a:blip r:embed="rId6">
+                    <a:blip r:embed="rId7">
                       <a:extLst>
                         <a:ext uri="{28A0092B-C50C-407E-A947-70E740481C1C}">
                           <a14:useLocalDpi xmlns:a14="http://schemas.microsoft.com/office/drawing/2010/main" val="0"/>
@@ -2214,29 +2465,24 @@
       <w:r>
         <w:rPr>
           <w:rFonts w:ascii="Times New Roman" w:eastAsiaTheme="minorEastAsia" w:hAnsi="Times New Roman" w:cs="Times New Roman"/>
+          <w:b/>
+          <w:bCs/>
           <w:noProof/>
+          <w14:ligatures w14:val="none"/>
         </w:rPr>
         <w:drawing>
-          <wp:anchor distT="0" distB="0" distL="114300" distR="114300" simplePos="0" relativeHeight="251659264" behindDoc="0" locked="0" layoutInCell="1" allowOverlap="1" wp14:anchorId="4027560B" wp14:editId="6FFA49B2">
+          <wp:anchor distT="0" distB="0" distL="114300" distR="114300" simplePos="0" relativeHeight="251664384" behindDoc="0" locked="0" layoutInCell="1" allowOverlap="1" wp14:anchorId="264E5197" wp14:editId="7AA1E90E">
             <wp:simplePos x="0" y="0"/>
             <wp:positionH relativeFrom="column">
-              <wp:posOffset>3465195</wp:posOffset>
+              <wp:posOffset>570865</wp:posOffset>
             </wp:positionH>
             <wp:positionV relativeFrom="paragraph">
-              <wp:posOffset>1123315</wp:posOffset>
+              <wp:posOffset>2370455</wp:posOffset>
             </wp:positionV>
-            <wp:extent cx="2477135" cy="1061720"/>
-            <wp:effectExtent l="0" t="0" r="0" b="5080"/>
-            <wp:wrapThrough wrapText="bothSides">
-              <wp:wrapPolygon edited="0">
-                <wp:start x="0" y="0"/>
-                <wp:lineTo x="0" y="21316"/>
-                <wp:lineTo x="21428" y="21316"/>
-                <wp:lineTo x="21428" y="0"/>
-                <wp:lineTo x="0" y="0"/>
-              </wp:wrapPolygon>
-            </wp:wrapThrough>
-            <wp:docPr id="5" name="Рисунок 5"/>
+            <wp:extent cx="4912995" cy="918210"/>
+            <wp:effectExtent l="0" t="0" r="1905" b="0"/>
+            <wp:wrapTopAndBottom/>
+            <wp:docPr id="951887911" name="Рисунок 2"/>
             <wp:cNvGraphicFramePr>
               <a:graphicFrameLocks xmlns:a="http://schemas.openxmlformats.org/drawingml/2006/main" noChangeAspect="1"/>
             </wp:cNvGraphicFramePr>
@@ -2244,36 +2490,29 @@
               <a:graphicData uri="http://schemas.openxmlformats.org/drawingml/2006/picture">
                 <pic:pic xmlns:pic="http://schemas.openxmlformats.org/drawingml/2006/picture">
                   <pic:nvPicPr>
-                    <pic:cNvPr id="0" name="Picture 2"/>
-                    <pic:cNvPicPr>
-                      <a:picLocks noChangeAspect="1" noChangeArrowheads="1"/>
-                    </pic:cNvPicPr>
+                    <pic:cNvPr id="951887911" name="Рисунок 951887911"/>
+                    <pic:cNvPicPr/>
                   </pic:nvPicPr>
                   <pic:blipFill>
-                    <a:blip r:embed="rId7">
+                    <a:blip r:embed="rId8">
                       <a:extLst>
                         <a:ext uri="{28A0092B-C50C-407E-A947-70E740481C1C}">
                           <a14:useLocalDpi xmlns:a14="http://schemas.microsoft.com/office/drawing/2010/main" val="0"/>
                         </a:ext>
                       </a:extLst>
                     </a:blip>
-                    <a:srcRect/>
                     <a:stretch>
                       <a:fillRect/>
                     </a:stretch>
                   </pic:blipFill>
-                  <pic:spPr bwMode="auto">
+                  <pic:spPr>
                     <a:xfrm>
                       <a:off x="0" y="0"/>
-                      <a:ext cx="2477135" cy="1061720"/>
+                      <a:ext cx="4912995" cy="918210"/>
                     </a:xfrm>
                     <a:prstGeom prst="rect">
                       <a:avLst/>
                     </a:prstGeom>
-                    <a:noFill/>
-                    <a:ln>
-                      <a:noFill/>
-                    </a:ln>
                   </pic:spPr>
                 </pic:pic>
               </a:graphicData>
@@ -2291,6 +2530,199 @@
         <w:rPr>
           <w:rFonts w:ascii="Times New Roman" w:eastAsiaTheme="minorEastAsia" w:hAnsi="Times New Roman" w:cs="Times New Roman"/>
         </w:rPr>
+        <w:t xml:space="preserve">третьим/четвертым в силу набега фазы </w:t>
+      </w:r>
+      <m:oMath>
+        <m:r>
+          <m:rPr>
+            <m:sty m:val="p"/>
+          </m:rPr>
+          <w:rPr>
+            <w:rFonts w:ascii="Cambria Math" w:eastAsiaTheme="minorEastAsia" w:hAnsi="Cambria Math" w:cs="Times New Roman"/>
+          </w:rPr>
+          <m:t>π</m:t>
+        </m:r>
+      </m:oMath>
+      <w:r>
+        <w:rPr>
+          <w:rFonts w:ascii="Times New Roman" w:eastAsiaTheme="minorEastAsia" w:hAnsi="Times New Roman" w:cs="Times New Roman"/>
+        </w:rPr>
+        <w:t>.</w:t>
+      </w:r>
+    </w:p>
+    <w:p>
+      <w:pPr>
+        <w:spacing w:line="360" w:lineRule="auto"/>
+        <w:ind w:firstLine="708"/>
+        <w:jc w:val="both"/>
+        <w:rPr>
+          <w:rFonts w:ascii="Times New Roman" w:eastAsiaTheme="minorEastAsia" w:hAnsi="Times New Roman" w:cs="Times New Roman"/>
+        </w:rPr>
+      </w:pPr>
+      <w:r>
+        <w:rPr>
+          <w:noProof/>
+        </w:rPr>
+        <mc:AlternateContent>
+          <mc:Choice Requires="wps">
+            <w:drawing>
+              <wp:anchor distT="0" distB="0" distL="114300" distR="114300" simplePos="0" relativeHeight="251669504" behindDoc="0" locked="0" layoutInCell="1" allowOverlap="1" wp14:anchorId="50C4A653" wp14:editId="239C01CF">
+                <wp:simplePos x="0" y="0"/>
+                <wp:positionH relativeFrom="column">
+                  <wp:posOffset>6985</wp:posOffset>
+                </wp:positionH>
+                <wp:positionV relativeFrom="paragraph">
+                  <wp:posOffset>7703911</wp:posOffset>
+                </wp:positionV>
+                <wp:extent cx="2862580" cy="635"/>
+                <wp:effectExtent l="0" t="0" r="0" b="12065"/>
+                <wp:wrapSquare wrapText="bothSides"/>
+                <wp:docPr id="865635115" name="Надпись 1"/>
+                <wp:cNvGraphicFramePr/>
+                <a:graphic xmlns:a="http://schemas.openxmlformats.org/drawingml/2006/main">
+                  <a:graphicData uri="http://schemas.microsoft.com/office/word/2010/wordprocessingShape">
+                    <wps:wsp>
+                      <wps:cNvSpPr txBox="1"/>
+                      <wps:spPr>
+                        <a:xfrm>
+                          <a:off x="0" y="0"/>
+                          <a:ext cx="2862580" cy="635"/>
+                        </a:xfrm>
+                        <a:prstGeom prst="rect">
+                          <a:avLst/>
+                        </a:prstGeom>
+                        <a:solidFill>
+                          <a:prstClr val="white"/>
+                        </a:solidFill>
+                        <a:ln>
+                          <a:noFill/>
+                        </a:ln>
+                      </wps:spPr>
+                      <wps:txbx>
+                        <w:txbxContent>
+                          <w:p>
+                            <w:pPr>
+                              <w:pStyle w:val="a7"/>
+                              <w:rPr>
+                                <w:rFonts w:ascii="Times New Roman" w:hAnsi="Times New Roman" w:cs="Times New Roman"/>
+                                <w:noProof/>
+                                <w:sz w:val="22"/>
+                                <w:szCs w:val="22"/>
+                                <w14:ligatures w14:val="none"/>
+                              </w:rPr>
+                            </w:pPr>
+                            <w:r>
+                              <w:t>Рис. 3 План расстановки элементов кольца в форме 8</w:t>
+                            </w:r>
+                          </w:p>
+                        </w:txbxContent>
+                      </wps:txbx>
+                      <wps:bodyPr rot="0" spcFirstLastPara="0" vertOverflow="overflow" horzOverflow="overflow" vert="horz" wrap="square" lIns="0" tIns="0" rIns="0" bIns="0" numCol="1" spcCol="0" rtlCol="0" fromWordArt="0" anchor="t" anchorCtr="0" forceAA="0" compatLnSpc="1">
+                        <a:prstTxWarp prst="textNoShape">
+                          <a:avLst/>
+                        </a:prstTxWarp>
+                        <a:spAutoFit/>
+                      </wps:bodyPr>
+                    </wps:wsp>
+                  </a:graphicData>
+                </a:graphic>
+              </wp:anchor>
+            </w:drawing>
+          </mc:Choice>
+          <mc:Fallback>
+            <w:pict>
+              <v:shape w14:anchorId="50C4A653" id="_x0000_s1028" type="#_x0000_t202" style="position:absolute;left:0;text-align:left;margin-left:.55pt;margin-top:606.6pt;width:225.4pt;height:.05pt;z-index:251669504;visibility:visible;mso-wrap-style:square;mso-wrap-distance-left:9pt;mso-wrap-distance-top:0;mso-wrap-distance-right:9pt;mso-wrap-distance-bottom:0;mso-position-horizontal:absolute;mso-position-horizontal-relative:text;mso-position-vertical:absolute;mso-position-vertical-relative:text;v-text-anchor:top" o:gfxdata="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" stroked="f">
+                <v:textbox style="mso-fit-shape-to-text:t" inset="0,0,0,0">
+                  <w:txbxContent>
+                    <w:p>
+                      <w:pPr>
+                        <w:pStyle w:val="a7"/>
+                        <w:rPr>
+                          <w:rFonts w:ascii="Times New Roman" w:hAnsi="Times New Roman" w:cs="Times New Roman"/>
+                          <w:noProof/>
+                          <w:sz w:val="22"/>
+                          <w:szCs w:val="22"/>
+                          <w14:ligatures w14:val="none"/>
+                        </w:rPr>
+                      </w:pPr>
+                      <w:r>
+                        <w:t>Рис. 3 План расстановки элементов кольца в форме 8</w:t>
+                      </w:r>
+                    </w:p>
+                  </w:txbxContent>
+                </v:textbox>
+                <w10:wrap type="square"/>
+              </v:shape>
+            </w:pict>
+          </mc:Fallback>
+        </mc:AlternateContent>
+      </w:r>
+      <w:r>
+        <w:rPr>
+          <w:rFonts w:ascii="Times New Roman" w:eastAsiaTheme="minorEastAsia" w:hAnsi="Times New Roman" w:cs="Times New Roman"/>
+          <w:noProof/>
+          <w14:ligatures w14:val="none"/>
+        </w:rPr>
+        <w:drawing>
+          <wp:anchor distT="0" distB="0" distL="114300" distR="114300" simplePos="0" relativeHeight="251663360" behindDoc="0" locked="0" layoutInCell="1" allowOverlap="1" wp14:anchorId="3A3A2E96" wp14:editId="7C4C1307">
+            <wp:simplePos x="0" y="0"/>
+            <wp:positionH relativeFrom="column">
+              <wp:posOffset>-3810</wp:posOffset>
+            </wp:positionH>
+            <wp:positionV relativeFrom="paragraph">
+              <wp:posOffset>2922814</wp:posOffset>
+            </wp:positionV>
+            <wp:extent cx="2862580" cy="4688205"/>
+            <wp:effectExtent l="0" t="0" r="0" b="0"/>
+            <wp:wrapSquare wrapText="bothSides"/>
+            <wp:docPr id="630144909" name="Рисунок 1"/>
+            <wp:cNvGraphicFramePr>
+              <a:graphicFrameLocks xmlns:a="http://schemas.openxmlformats.org/drawingml/2006/main" noChangeAspect="1"/>
+            </wp:cNvGraphicFramePr>
+            <a:graphic xmlns:a="http://schemas.openxmlformats.org/drawingml/2006/main">
+              <a:graphicData uri="http://schemas.openxmlformats.org/drawingml/2006/picture">
+                <pic:pic xmlns:pic="http://schemas.openxmlformats.org/drawingml/2006/picture">
+                  <pic:nvPicPr>
+                    <pic:cNvPr id="630144909" name="Рисунок 630144909"/>
+                    <pic:cNvPicPr/>
+                  </pic:nvPicPr>
+                  <pic:blipFill>
+                    <a:blip r:embed="rId9" cstate="print">
+                      <a:extLst>
+                        <a:ext uri="{28A0092B-C50C-407E-A947-70E740481C1C}">
+                          <a14:useLocalDpi xmlns:a14="http://schemas.microsoft.com/office/drawing/2010/main" val="0"/>
+                        </a:ext>
+                      </a:extLst>
+                    </a:blip>
+                    <a:stretch>
+                      <a:fillRect/>
+                    </a:stretch>
+                  </pic:blipFill>
+                  <pic:spPr>
+                    <a:xfrm>
+                      <a:off x="0" y="0"/>
+                      <a:ext cx="2862580" cy="4688205"/>
+                    </a:xfrm>
+                    <a:prstGeom prst="rect">
+                      <a:avLst/>
+                    </a:prstGeom>
+                  </pic:spPr>
+                </pic:pic>
+              </a:graphicData>
+            </a:graphic>
+            <wp14:sizeRelH relativeFrom="page">
+              <wp14:pctWidth>0</wp14:pctWidth>
+            </wp14:sizeRelH>
+            <wp14:sizeRelV relativeFrom="page">
+              <wp14:pctHeight>0</wp14:pctHeight>
+            </wp14:sizeRelV>
+          </wp:anchor>
+        </w:drawing>
+      </w:r>
+      <w:r>
+        <w:rPr>
+          <w:rFonts w:ascii="Times New Roman" w:eastAsiaTheme="minorEastAsia" w:hAnsi="Times New Roman" w:cs="Times New Roman"/>
+        </w:rPr>
         <w:t>Поворотные арки кольца в форме 8-ки дополнительно поворачивают импульс на угол</w:t>
       </w:r>
       <w:r>
@@ -2314,7 +2746,31 @@
         <w:rPr>
           <w:rFonts w:ascii="Times New Roman" w:eastAsiaTheme="minorEastAsia" w:hAnsi="Times New Roman" w:cs="Times New Roman"/>
         </w:rPr>
-        <w:t>. При уменьшении угла, увеличивается соответствующая длина прямых секций</w:t>
+        <w:t>, соответствующим образом увеличивается длина поворотной арки</w:t>
+      </w:r>
+      <w:r>
+        <w:rPr>
+          <w:rFonts w:ascii="Times New Roman" w:eastAsiaTheme="minorEastAsia" w:hAnsi="Times New Roman" w:cs="Times New Roman"/>
+        </w:rPr>
+        <w:t xml:space="preserve">. </w:t>
+      </w:r>
+      <w:r>
+        <w:rPr>
+          <w:rFonts w:ascii="Times New Roman" w:eastAsiaTheme="minorEastAsia" w:hAnsi="Times New Roman" w:cs="Times New Roman"/>
+        </w:rPr>
+        <w:t>Д</w:t>
+      </w:r>
+      <w:r>
+        <w:rPr>
+          <w:rFonts w:ascii="Times New Roman" w:eastAsiaTheme="minorEastAsia" w:hAnsi="Times New Roman" w:cs="Times New Roman"/>
+        </w:rPr>
+        <w:t>лина прямых секций</w:t>
+      </w:r>
+      <w:r>
+        <w:rPr>
+          <w:rFonts w:ascii="Times New Roman" w:eastAsiaTheme="minorEastAsia" w:hAnsi="Times New Roman" w:cs="Times New Roman"/>
+        </w:rPr>
+        <w:t xml:space="preserve"> в зависти от угла отклонения составляет</w:t>
       </w:r>
       <w:r>
         <w:rPr>
@@ -2443,7 +2899,13 @@
         <w:rPr>
           <w:rFonts w:ascii="Times New Roman" w:eastAsiaTheme="minorEastAsia" w:hAnsi="Times New Roman" w:cs="Times New Roman"/>
         </w:rPr>
-        <w:t xml:space="preserve"> и расстояние между поворотным арками </w:t>
+        <w:t xml:space="preserve">, а </w:t>
+      </w:r>
+      <w:r>
+        <w:rPr>
+          <w:rFonts w:ascii="Times New Roman" w:eastAsiaTheme="minorEastAsia" w:hAnsi="Times New Roman" w:cs="Times New Roman"/>
+        </w:rPr>
+        <w:t xml:space="preserve">расстояние между поворотным арками </w:t>
       </w:r>
       <m:oMath>
         <m:sSub>
@@ -2624,6 +3086,30 @@
       </w:r>
       <w:r>
         <w:rPr>
+          <w:rFonts w:ascii="Times New Roman" w:eastAsiaTheme="minorEastAsia" w:hAnsi="Times New Roman" w:cs="Times New Roman"/>
+        </w:rPr>
+        <w:t xml:space="preserve">План расстановки элементарных ФОДО ячеек в структуре представлен на Рис. </w:t>
+      </w:r>
+      <w:r>
+        <w:rPr>
+          <w:rFonts w:ascii="Times New Roman" w:eastAsiaTheme="minorEastAsia" w:hAnsi="Times New Roman" w:cs="Times New Roman"/>
+        </w:rPr>
+        <w:t>2</w:t>
+      </w:r>
+      <w:r>
+        <w:rPr>
+          <w:rFonts w:ascii="Times New Roman" w:eastAsiaTheme="minorEastAsia" w:hAnsi="Times New Roman" w:cs="Times New Roman"/>
+        </w:rPr>
+        <w:t>, две крайние ячейки осуществляют дополнительный поворот.</w:t>
+      </w:r>
+      <w:r>
+        <w:rPr>
+          <w:rFonts w:ascii="Times New Roman" w:eastAsiaTheme="minorEastAsia" w:hAnsi="Times New Roman" w:cs="Times New Roman"/>
+        </w:rPr>
+        <w:t xml:space="preserve"> </w:t>
+      </w:r>
+      <w:r>
+        <w:rPr>
           <w:rFonts w:ascii="Times New Roman" w:hAnsi="Times New Roman" w:cs="Times New Roman"/>
         </w:rPr>
         <w:t>Выбранное количество суперпериодов, определяет количество ячеек, а значит и эффективную длину магнитов для заданного магнитного поля</w:t>
@@ -2656,6 +3142,9 @@
           </m:e>
           <m:sub>
             <m:r>
+              <m:rPr>
+                <m:sty m:val="p"/>
+              </m:rPr>
               <w:rPr>
                 <w:rFonts w:ascii="Cambria Math" w:hAnsi="Cambria Math" w:cs="Times New Roman"/>
                 <w:lang w:val="en-US"/>
@@ -3116,7 +3605,14 @@
         <w:rPr>
           <w:rFonts w:ascii="Times New Roman" w:hAnsi="Times New Roman" w:cs="Times New Roman"/>
         </w:rPr>
-        <w:t xml:space="preserve">), магнитная жесткость составляет </w:t>
+        <w:t xml:space="preserve">), магнитная жесткость </w:t>
+      </w:r>
+      <w:r>
+        <w:rPr>
+          <w:rFonts w:ascii="Times New Roman" w:hAnsi="Times New Roman" w:cs="Times New Roman"/>
+        </w:rPr>
+        <w:lastRenderedPageBreak/>
+        <w:t xml:space="preserve">составляет </w:t>
       </w:r>
       <m:oMath>
         <m:r>
@@ -3194,14 +3690,11 @@
           </m:e>
           <m:sub>
             <m:r>
-              <m:rPr>
-                <m:sty m:val="p"/>
-              </m:rPr>
               <w:rPr>
                 <w:rFonts w:ascii="Cambria Math" w:eastAsiaTheme="minorEastAsia" w:hAnsi="Cambria Math" w:cs="Times New Roman"/>
                 <w:lang w:val="en-US"/>
               </w:rPr>
-              <m:t>mag</m:t>
+              <m:t>B</m:t>
             </m:r>
           </m:sub>
         </m:sSub>
@@ -3297,7 +3790,80 @@
           <w:rPr>
             <w:rFonts w:ascii="Cambria Math" w:eastAsiaTheme="minorEastAsia" w:hAnsi="Cambria Math" w:cs="Times New Roman"/>
           </w:rPr>
-          <m:t xml:space="preserve"> 16</m:t>
+          <m:t xml:space="preserve"> 167</m:t>
+        </m:r>
+      </m:oMath>
+      <w:r>
+        <w:rPr>
+          <w:rFonts w:ascii="Times New Roman" w:eastAsiaTheme="minorEastAsia" w:hAnsi="Times New Roman" w:cs="Times New Roman"/>
+        </w:rPr>
+        <w:t xml:space="preserve"> м</w:t>
+      </w:r>
+      <w:r>
+        <w:rPr>
+          <w:rFonts w:ascii="Times New Roman" w:eastAsiaTheme="minorEastAsia" w:hAnsi="Times New Roman" w:cs="Times New Roman"/>
+        </w:rPr>
+        <w:t>.</w:t>
+      </w:r>
+      <w:r>
+        <w:rPr>
+          <w:rFonts w:ascii="Times New Roman" w:eastAsiaTheme="minorEastAsia" w:hAnsi="Times New Roman" w:cs="Times New Roman"/>
+        </w:rPr>
+        <w:t xml:space="preserve"> </w:t>
+      </w:r>
+      <w:r>
+        <w:rPr>
+          <w:rFonts w:ascii="Times New Roman" w:eastAsiaTheme="minorEastAsia" w:hAnsi="Times New Roman" w:cs="Times New Roman"/>
+        </w:rPr>
+        <w:t xml:space="preserve">Длина одного магнита </w:t>
+      </w:r>
+      <m:oMath>
+        <m:sSub>
+          <m:sSubPr>
+            <m:ctrlPr>
+              <w:rPr>
+                <w:rFonts w:ascii="Cambria Math" w:eastAsiaTheme="minorEastAsia" w:hAnsi="Cambria Math" w:cs="Times New Roman"/>
+                <w:i/>
+              </w:rPr>
+            </m:ctrlPr>
+          </m:sSubPr>
+          <m:e>
+            <m:r>
+              <w:rPr>
+                <w:rFonts w:ascii="Cambria Math" w:eastAsiaTheme="minorEastAsia" w:hAnsi="Cambria Math" w:cs="Times New Roman"/>
+                <w:lang w:val="en-US"/>
+              </w:rPr>
+              <m:t>L</m:t>
+            </m:r>
+            <m:ctrlPr>
+              <w:rPr>
+                <w:rFonts w:ascii="Cambria Math" w:eastAsiaTheme="minorEastAsia" w:hAnsi="Cambria Math" w:cs="Times New Roman"/>
+                <w:i/>
+                <w:lang w:val="en-US"/>
+              </w:rPr>
+            </m:ctrlPr>
+          </m:e>
+          <m:sub>
+            <m:r>
+              <m:rPr>
+                <m:sty m:val="p"/>
+              </m:rPr>
+              <w:rPr>
+                <w:rFonts w:ascii="Cambria Math" w:eastAsiaTheme="minorEastAsia" w:hAnsi="Cambria Math" w:cs="Times New Roman"/>
+                <w:lang w:val="en-US"/>
+              </w:rPr>
+              <m:t>mag</m:t>
+            </m:r>
+          </m:sub>
+        </m:sSub>
+        <m:r>
+          <m:rPr>
+            <m:sty m:val="p"/>
+          </m:rPr>
+          <w:rPr>
+            <w:rFonts w:ascii="Cambria Math" w:eastAsiaTheme="minorEastAsia" w:hAnsi="Cambria Math" w:cs="Times New Roman"/>
+          </w:rPr>
+          <m:t xml:space="preserve">= </m:t>
         </m:r>
         <m:r>
           <m:rPr>
@@ -3306,32 +3872,32 @@
           <w:rPr>
             <w:rFonts w:ascii="Cambria Math" w:eastAsiaTheme="minorEastAsia" w:hAnsi="Cambria Math" w:cs="Times New Roman"/>
           </w:rPr>
-          <m:t>7</m:t>
+          <m:t>242.8</m:t>
         </m:r>
       </m:oMath>
       <w:r>
         <w:rPr>
           <w:rFonts w:ascii="Times New Roman" w:eastAsiaTheme="minorEastAsia" w:hAnsi="Times New Roman" w:cs="Times New Roman"/>
         </w:rPr>
-        <w:t xml:space="preserve"> м</w:t>
-      </w:r>
-      <w:r>
-        <w:rPr>
-          <w:rFonts w:ascii="Times New Roman" w:eastAsiaTheme="minorEastAsia" w:hAnsi="Times New Roman" w:cs="Times New Roman"/>
-        </w:rPr>
-        <w:t>.</w:t>
-      </w:r>
-      <w:r>
-        <w:rPr>
-          <w:rFonts w:ascii="Times New Roman" w:eastAsiaTheme="minorEastAsia" w:hAnsi="Times New Roman" w:cs="Times New Roman"/>
-        </w:rPr>
-        <w:t xml:space="preserve"> План расстановки элементов представлен на Рис. 2</w:t>
-      </w:r>
-      <w:r>
-        <w:rPr>
-          <w:rFonts w:ascii="Times New Roman" w:eastAsiaTheme="minorEastAsia" w:hAnsi="Times New Roman" w:cs="Times New Roman"/>
-        </w:rPr>
-        <w:t>, структура состоит из ФОДО ячеек.</w:t>
+        <w:t xml:space="preserve"> </w:t>
+      </w:r>
+      <w:r>
+        <w:rPr>
+          <w:rFonts w:ascii="Times New Roman" w:eastAsiaTheme="minorEastAsia" w:hAnsi="Times New Roman" w:cs="Times New Roman"/>
+        </w:rPr>
+        <w:t>см.</w:t>
+      </w:r>
+      <w:r>
+        <w:rPr>
+          <w:rFonts w:ascii="Times New Roman" w:eastAsiaTheme="minorEastAsia" w:hAnsi="Times New Roman" w:cs="Times New Roman"/>
+        </w:rPr>
+        <w:t xml:space="preserve"> На Рис. 3 показан план расстановки элементов с оптимизированной длиной прямых секций</w:t>
+      </w:r>
+      <w:r>
+        <w:rPr>
+          <w:rFonts w:ascii="Times New Roman" w:eastAsiaTheme="minorEastAsia" w:hAnsi="Times New Roman" w:cs="Times New Roman"/>
+        </w:rPr>
+        <w:t xml:space="preserve">. </w:t>
       </w:r>
     </w:p>
     <w:p>
@@ -3341,20 +3907,222 @@
         <w:jc w:val="both"/>
         <w:rPr>
           <w:rFonts w:ascii="Times New Roman" w:eastAsiaTheme="minorEastAsia" w:hAnsi="Times New Roman" w:cs="Times New Roman"/>
-          <w:i/>
         </w:rPr>
       </w:pPr>
       <w:r>
         <w:rPr>
-          <w:rFonts w:ascii="Times New Roman" w:eastAsiaTheme="minorEastAsia" w:hAnsi="Times New Roman" w:cs="Times New Roman"/>
-        </w:rPr>
-        <w:t xml:space="preserve">Параметры Твисса </w:t>
-      </w:r>
-      <w:r>
-        <w:rPr>
-          <w:rFonts w:ascii="Times New Roman" w:eastAsiaTheme="minorEastAsia" w:hAnsi="Times New Roman" w:cs="Times New Roman"/>
-        </w:rPr>
-        <w:t>показаны на Рис. 3</w:t>
+          <w:noProof/>
+        </w:rPr>
+        <mc:AlternateContent>
+          <mc:Choice Requires="wps">
+            <w:drawing>
+              <wp:anchor distT="0" distB="0" distL="114300" distR="114300" simplePos="0" relativeHeight="251671552" behindDoc="0" locked="0" layoutInCell="1" allowOverlap="1" wp14:anchorId="35709834" wp14:editId="5ABD3788">
+                <wp:simplePos x="0" y="0"/>
+                <wp:positionH relativeFrom="column">
+                  <wp:posOffset>97790</wp:posOffset>
+                </wp:positionH>
+                <wp:positionV relativeFrom="paragraph">
+                  <wp:posOffset>4067175</wp:posOffset>
+                </wp:positionV>
+                <wp:extent cx="5940425" cy="635"/>
+                <wp:effectExtent l="0" t="0" r="3175" b="12065"/>
+                <wp:wrapThrough wrapText="bothSides">
+                  <wp:wrapPolygon edited="0">
+                    <wp:start x="0" y="0"/>
+                    <wp:lineTo x="0" y="0"/>
+                    <wp:lineTo x="21565" y="0"/>
+                    <wp:lineTo x="21565" y="0"/>
+                    <wp:lineTo x="0" y="0"/>
+                  </wp:wrapPolygon>
+                </wp:wrapThrough>
+                <wp:docPr id="1554600599" name="Надпись 1"/>
+                <wp:cNvGraphicFramePr/>
+                <a:graphic xmlns:a="http://schemas.openxmlformats.org/drawingml/2006/main">
+                  <a:graphicData uri="http://schemas.microsoft.com/office/word/2010/wordprocessingShape">
+                    <wps:wsp>
+                      <wps:cNvSpPr txBox="1"/>
+                      <wps:spPr>
+                        <a:xfrm>
+                          <a:off x="0" y="0"/>
+                          <a:ext cx="5940425" cy="635"/>
+                        </a:xfrm>
+                        <a:prstGeom prst="rect">
+                          <a:avLst/>
+                        </a:prstGeom>
+                        <a:solidFill>
+                          <a:prstClr val="white"/>
+                        </a:solidFill>
+                        <a:ln>
+                          <a:noFill/>
+                        </a:ln>
+                      </wps:spPr>
+                      <wps:txbx>
+                        <w:txbxContent>
+                          <w:p>
+                            <w:pPr>
+                              <w:pStyle w:val="a7"/>
+                              <w:rPr>
+                                <w:rFonts w:ascii="Times New Roman" w:hAnsi="Times New Roman" w:cs="Times New Roman"/>
+                                <w:noProof/>
+                                <w:sz w:val="22"/>
+                                <w:szCs w:val="22"/>
+                              </w:rPr>
+                            </w:pPr>
+                            <w:r>
+                              <w:t xml:space="preserve">Рис. 4 </w:t>
+                            </w:r>
+                            <w:proofErr w:type="spellStart"/>
+                            <w:r>
+                              <w:t>Твисс</w:t>
+                            </w:r>
+                            <w:proofErr w:type="spellEnd"/>
+                            <w:r>
+                              <w:t>-функции резонансной структуры, состоящей из 2-х арок с различной кривизной и двух прямых секций</w:t>
+                            </w:r>
+                          </w:p>
+                        </w:txbxContent>
+                      </wps:txbx>
+                      <wps:bodyPr rot="0" spcFirstLastPara="0" vertOverflow="overflow" horzOverflow="overflow" vert="horz" wrap="square" lIns="0" tIns="0" rIns="0" bIns="0" numCol="1" spcCol="0" rtlCol="0" fromWordArt="0" anchor="t" anchorCtr="0" forceAA="0" compatLnSpc="1">
+                        <a:prstTxWarp prst="textNoShape">
+                          <a:avLst/>
+                        </a:prstTxWarp>
+                        <a:spAutoFit/>
+                      </wps:bodyPr>
+                    </wps:wsp>
+                  </a:graphicData>
+                </a:graphic>
+              </wp:anchor>
+            </w:drawing>
+          </mc:Choice>
+          <mc:Fallback>
+            <w:pict>
+              <v:shape w14:anchorId="35709834" id="_x0000_s1029" type="#_x0000_t202" style="position:absolute;left:0;text-align:left;margin-left:7.7pt;margin-top:320.25pt;width:467.75pt;height:.05pt;z-index:251671552;visibility:visible;mso-wrap-style:square;mso-wrap-distance-left:9pt;mso-wrap-distance-top:0;mso-wrap-distance-right:9pt;mso-wrap-distance-bottom:0;mso-position-horizontal:absolute;mso-position-horizontal-relative:text;mso-position-vertical:absolute;mso-position-vertical-relative:text;v-text-anchor:top" o:gfxdata="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" stroked="f">
+                <v:textbox style="mso-fit-shape-to-text:t" inset="0,0,0,0">
+                  <w:txbxContent>
+                    <w:p>
+                      <w:pPr>
+                        <w:pStyle w:val="a7"/>
+                        <w:rPr>
+                          <w:rFonts w:ascii="Times New Roman" w:hAnsi="Times New Roman" w:cs="Times New Roman"/>
+                          <w:noProof/>
+                          <w:sz w:val="22"/>
+                          <w:szCs w:val="22"/>
+                        </w:rPr>
+                      </w:pPr>
+                      <w:r>
+                        <w:t xml:space="preserve">Рис. 4 </w:t>
+                      </w:r>
+                      <w:proofErr w:type="spellStart"/>
+                      <w:r>
+                        <w:t>Твисс</w:t>
+                      </w:r>
+                      <w:proofErr w:type="spellEnd"/>
+                      <w:r>
+                        <w:t>-функции резонансной структуры, состоящей из 2-х арок с различной кривизной и двух прямых секций</w:t>
+                      </w:r>
+                    </w:p>
+                  </w:txbxContent>
+                </v:textbox>
+                <w10:wrap type="through"/>
+              </v:shape>
+            </w:pict>
+          </mc:Fallback>
+        </mc:AlternateContent>
+      </w:r>
+      <w:r>
+        <w:rPr>
+          <w:rFonts w:ascii="Times New Roman" w:hAnsi="Times New Roman" w:cs="Times New Roman"/>
+          <w:noProof/>
+        </w:rPr>
+        <w:drawing>
+          <wp:anchor distT="0" distB="0" distL="114300" distR="114300" simplePos="0" relativeHeight="251665408" behindDoc="0" locked="0" layoutInCell="1" allowOverlap="1" wp14:anchorId="427395F7" wp14:editId="37A2224F">
+            <wp:simplePos x="0" y="0"/>
+            <wp:positionH relativeFrom="column">
+              <wp:posOffset>0</wp:posOffset>
+            </wp:positionH>
+            <wp:positionV relativeFrom="paragraph">
+              <wp:posOffset>1029607</wp:posOffset>
+            </wp:positionV>
+            <wp:extent cx="5940425" cy="2828290"/>
+            <wp:effectExtent l="0" t="0" r="3175" b="3810"/>
+            <wp:wrapThrough wrapText="bothSides">
+              <wp:wrapPolygon edited="0">
+                <wp:start x="0" y="0"/>
+                <wp:lineTo x="0" y="21532"/>
+                <wp:lineTo x="21565" y="21532"/>
+                <wp:lineTo x="21565" y="0"/>
+                <wp:lineTo x="0" y="0"/>
+              </wp:wrapPolygon>
+            </wp:wrapThrough>
+            <wp:docPr id="2" name="Рисунок 2"/>
+            <wp:cNvGraphicFramePr>
+              <a:graphicFrameLocks xmlns:a="http://schemas.openxmlformats.org/drawingml/2006/main" noChangeAspect="1"/>
+            </wp:cNvGraphicFramePr>
+            <a:graphic xmlns:a="http://schemas.openxmlformats.org/drawingml/2006/main">
+              <a:graphicData uri="http://schemas.openxmlformats.org/drawingml/2006/picture">
+                <pic:pic xmlns:pic="http://schemas.openxmlformats.org/drawingml/2006/picture">
+                  <pic:nvPicPr>
+                    <pic:cNvPr id="1" name=""/>
+                    <pic:cNvPicPr/>
+                  </pic:nvPicPr>
+                  <pic:blipFill>
+                    <a:blip r:embed="rId10">
+                      <a:extLst>
+                        <a:ext uri="{28A0092B-C50C-407E-A947-70E740481C1C}">
+                          <a14:useLocalDpi xmlns:a14="http://schemas.microsoft.com/office/drawing/2010/main" val="0"/>
+                        </a:ext>
+                      </a:extLst>
+                    </a:blip>
+                    <a:stretch>
+                      <a:fillRect/>
+                    </a:stretch>
+                  </pic:blipFill>
+                  <pic:spPr>
+                    <a:xfrm>
+                      <a:off x="0" y="0"/>
+                      <a:ext cx="5940425" cy="2828290"/>
+                    </a:xfrm>
+                    <a:prstGeom prst="rect">
+                      <a:avLst/>
+                    </a:prstGeom>
+                  </pic:spPr>
+                </pic:pic>
+              </a:graphicData>
+            </a:graphic>
+            <wp14:sizeRelH relativeFrom="page">
+              <wp14:pctWidth>0</wp14:pctWidth>
+            </wp14:sizeRelH>
+            <wp14:sizeRelV relativeFrom="page">
+              <wp14:pctHeight>0</wp14:pctHeight>
+            </wp14:sizeRelV>
+          </wp:anchor>
+        </w:drawing>
+      </w:r>
+      <w:r>
+        <w:rPr>
+          <w:rFonts w:ascii="Times New Roman" w:eastAsiaTheme="minorEastAsia" w:hAnsi="Times New Roman" w:cs="Times New Roman"/>
+        </w:rPr>
+        <w:t xml:space="preserve">Параметры </w:t>
+      </w:r>
+      <w:proofErr w:type="spellStart"/>
+      <w:r>
+        <w:rPr>
+          <w:rFonts w:ascii="Times New Roman" w:eastAsiaTheme="minorEastAsia" w:hAnsi="Times New Roman" w:cs="Times New Roman"/>
+        </w:rPr>
+        <w:t>Твисса</w:t>
+      </w:r>
+      <w:proofErr w:type="spellEnd"/>
+      <w:r>
+        <w:rPr>
+          <w:rFonts w:ascii="Times New Roman" w:eastAsiaTheme="minorEastAsia" w:hAnsi="Times New Roman" w:cs="Times New Roman"/>
+        </w:rPr>
+        <w:t xml:space="preserve"> показаны на Рис. </w:t>
+      </w:r>
+      <w:r>
+        <w:rPr>
+          <w:rFonts w:ascii="Times New Roman" w:eastAsiaTheme="minorEastAsia" w:hAnsi="Times New Roman" w:cs="Times New Roman"/>
+        </w:rPr>
+        <w:t>4</w:t>
       </w:r>
       <w:r>
         <w:rPr>
@@ -3555,19 +4323,7 @@
           <w:rPr>
             <w:rFonts w:ascii="Cambria Math" w:eastAsiaTheme="minorEastAsia" w:hAnsi="Cambria Math" w:cs="Times New Roman"/>
           </w:rPr>
-          <m:t>=3</m:t>
-        </m:r>
-        <m:r>
-          <w:rPr>
-            <w:rFonts w:ascii="Cambria Math" w:eastAsiaTheme="minorEastAsia" w:hAnsi="Cambria Math" w:cs="Times New Roman"/>
-          </w:rPr>
-          <m:t>6</m:t>
-        </m:r>
-        <m:r>
-          <w:rPr>
-            <w:rFonts w:ascii="Cambria Math" w:eastAsiaTheme="minorEastAsia" w:hAnsi="Cambria Math" w:cs="Times New Roman"/>
-          </w:rPr>
-          <m:t>%</m:t>
+          <m:t>=36%</m:t>
         </m:r>
       </m:oMath>
       <w:r>
@@ -3632,75 +4388,18 @@
     <w:p>
       <w:pPr>
         <w:spacing w:line="360" w:lineRule="auto"/>
+        <w:ind w:firstLine="708"/>
         <w:jc w:val="both"/>
         <w:rPr>
           <w:rFonts w:ascii="Times New Roman" w:eastAsiaTheme="minorEastAsia" w:hAnsi="Times New Roman" w:cs="Times New Roman"/>
         </w:rPr>
       </w:pPr>
-      <w:r>
-        <w:rPr>
-          <w:rFonts w:ascii="Times New Roman" w:hAnsi="Times New Roman" w:cs="Times New Roman"/>
-          <w:noProof/>
-        </w:rPr>
-        <w:lastRenderedPageBreak/>
-        <w:drawing>
-          <wp:inline distT="0" distB="0" distL="0" distR="0" wp14:anchorId="427395F7" wp14:editId="047DBAB0">
-            <wp:extent cx="5940425" cy="2828290"/>
-            <wp:effectExtent l="0" t="0" r="3175" b="0"/>
-            <wp:docPr id="2" name="Рисунок 2"/>
-            <wp:cNvGraphicFramePr>
-              <a:graphicFrameLocks xmlns:a="http://schemas.openxmlformats.org/drawingml/2006/main" noChangeAspect="1"/>
-            </wp:cNvGraphicFramePr>
-            <a:graphic xmlns:a="http://schemas.openxmlformats.org/drawingml/2006/main">
-              <a:graphicData uri="http://schemas.openxmlformats.org/drawingml/2006/picture">
-                <pic:pic xmlns:pic="http://schemas.openxmlformats.org/drawingml/2006/picture">
-                  <pic:nvPicPr>
-                    <pic:cNvPr id="1" name=""/>
-                    <pic:cNvPicPr/>
-                  </pic:nvPicPr>
-                  <pic:blipFill>
-                    <a:blip r:embed="rId8"/>
-                    <a:stretch>
-                      <a:fillRect/>
-                    </a:stretch>
-                  </pic:blipFill>
-                  <pic:spPr>
-                    <a:xfrm>
-                      <a:off x="0" y="0"/>
-                      <a:ext cx="5940425" cy="2828290"/>
-                    </a:xfrm>
-                    <a:prstGeom prst="rect">
-                      <a:avLst/>
-                    </a:prstGeom>
-                  </pic:spPr>
-                </pic:pic>
-              </a:graphicData>
-            </a:graphic>
-          </wp:inline>
-        </w:drawing>
-      </w:r>
-    </w:p>
-    <w:p>
-      <w:pPr>
-        <w:spacing w:line="360" w:lineRule="auto"/>
-        <w:rPr>
-          <w:rFonts w:ascii="Times New Roman" w:eastAsiaTheme="majorEastAsia" w:hAnsi="Times New Roman" w:cs="Times New Roman"/>
-          <w:color w:val="2F5496" w:themeColor="accent1" w:themeShade="BF"/>
-          <w:sz w:val="32"/>
-          <w:szCs w:val="32"/>
-        </w:rPr>
-      </w:pPr>
-      <w:r>
-        <w:rPr>
-          <w:rFonts w:ascii="Times New Roman" w:hAnsi="Times New Roman" w:cs="Times New Roman"/>
-        </w:rPr>
-        <w:br w:type="page"/>
-      </w:r>
     </w:p>
     <w:p>
       <w:pPr>
         <w:pStyle w:val="1"/>
         <w:spacing w:line="360" w:lineRule="auto"/>
+        <w:jc w:val="both"/>
         <w:rPr>
           <w:rFonts w:ascii="Times New Roman" w:hAnsi="Times New Roman" w:cs="Times New Roman"/>
         </w:rPr>
@@ -3709,7 +4408,6 @@
         <w:rPr>
           <w:rFonts w:ascii="Times New Roman" w:hAnsi="Times New Roman" w:cs="Times New Roman"/>
         </w:rPr>
-        <w:lastRenderedPageBreak/>
         <w:t>Квази-замороженная опция</w:t>
       </w:r>
     </w:p>
@@ -3797,25 +4495,56 @@
         <w:rPr>
           <w:rFonts w:ascii="Times New Roman" w:hAnsi="Times New Roman" w:cs="Times New Roman"/>
         </w:rPr>
-        <w:t xml:space="preserve">элементов с электрическим полем, для сохранения прямолинейной орбиты применяются прямые фильтры Вина со скрещенными магнитным и электрическим полями. Для кольца в форме 8-ки подавление МДМ-компоненты выполняется автоматически, однако не происходит накопление ЭДМ-компоненты. Чтобы накопить сигнал, необходимо использование как фильтра Вина, так и </w:t>
-      </w:r>
-      <w:r>
-        <w:rPr>
-          <w:rFonts w:ascii="Times New Roman" w:hAnsi="Times New Roman" w:cs="Times New Roman"/>
-        </w:rPr>
-        <w:t>соленоида</w:t>
-      </w:r>
-      <w:r>
-        <w:rPr>
-          <w:rFonts w:ascii="Times New Roman" w:hAnsi="Times New Roman" w:cs="Times New Roman"/>
-        </w:rPr>
-        <w:t xml:space="preserve"> на каждом прямолинейном участке.</w:t>
+        <w:t>элементов с электрическим полем, для сохранения прямолинейной орбиты применяются прямые фильтры Вина со скрещенными магнитным и электрическим полями. Для кольца в форме 8 подавление МДМ-компоненты выполняется автоматически, однако накопление ЭДМ-компоненты</w:t>
+      </w:r>
+      <w:r>
+        <w:rPr>
+          <w:rFonts w:ascii="Times New Roman" w:hAnsi="Times New Roman" w:cs="Times New Roman"/>
+        </w:rPr>
+        <w:t xml:space="preserve"> </w:t>
+      </w:r>
+      <w:r>
+        <w:rPr>
+          <w:rFonts w:ascii="Times New Roman" w:hAnsi="Times New Roman" w:cs="Times New Roman"/>
+        </w:rPr>
+        <w:t>не происходит</w:t>
+      </w:r>
+      <w:r>
+        <w:rPr>
+          <w:rFonts w:ascii="Times New Roman" w:hAnsi="Times New Roman" w:cs="Times New Roman"/>
+        </w:rPr>
+        <w:t xml:space="preserve">. </w:t>
+      </w:r>
+      <w:r>
+        <w:rPr>
+          <w:rFonts w:ascii="Times New Roman" w:hAnsi="Times New Roman" w:cs="Times New Roman"/>
+        </w:rPr>
+        <w:t>Для накопления</w:t>
+      </w:r>
+      <w:r>
+        <w:rPr>
+          <w:rFonts w:ascii="Times New Roman" w:hAnsi="Times New Roman" w:cs="Times New Roman"/>
+        </w:rPr>
+        <w:t xml:space="preserve"> сигна</w:t>
+      </w:r>
+      <w:r>
+        <w:rPr>
+          <w:rFonts w:ascii="Times New Roman" w:hAnsi="Times New Roman" w:cs="Times New Roman"/>
+        </w:rPr>
+        <w:t>ла</w:t>
+      </w:r>
+      <w:r>
+        <w:rPr>
+          <w:rFonts w:ascii="Times New Roman" w:hAnsi="Times New Roman" w:cs="Times New Roman"/>
+        </w:rPr>
+        <w:t>, необходимо использование как фильтра Вина, так и соленоида на каждом прямолинейном участке.</w:t>
       </w:r>
     </w:p>
     <w:p>
       <w:pPr>
         <w:spacing w:line="360" w:lineRule="auto"/>
         <w:ind w:firstLine="708"/>
+        <w:jc w:val="both"/>
         <w:rPr>
           <w:rFonts w:ascii="Times New Roman" w:hAnsi="Times New Roman" w:cs="Times New Roman"/>
         </w:rPr>
@@ -3848,24 +4577,13 @@
         <w:rPr>
           <w:rFonts w:ascii="Times New Roman" w:hAnsi="Times New Roman" w:cs="Times New Roman"/>
         </w:rPr>
-        <w:t xml:space="preserve">Для этого минимизируется отклонение равновесного уровня от эффективной </w:t>
-      </w:r>
-      <w:r>
-        <w:rPr>
-          <w:rFonts w:ascii="Times New Roman" w:hAnsi="Times New Roman" w:cs="Times New Roman"/>
-        </w:rPr>
-        <w:t>энергии</w:t>
-      </w:r>
-      <w:r>
-        <w:rPr>
-          <w:rFonts w:ascii="Times New Roman" w:hAnsi="Times New Roman" w:cs="Times New Roman"/>
-        </w:rPr>
-        <w:t>.</w:t>
+        <w:t>Для этого минимизируется отклонение равновесного уровня от эффективной энергии</w:t>
       </w:r>
     </w:p>
     <w:p>
       <w:pPr>
         <w:spacing w:line="360" w:lineRule="auto"/>
+        <w:jc w:val="both"/>
         <w:rPr>
           <w:rFonts w:ascii="Times New Roman" w:eastAsiaTheme="minorEastAsia" w:hAnsi="Times New Roman" w:cs="Times New Roman"/>
           <w:lang w:val="en-US"/>
@@ -4436,14 +5154,7 @@
                       <w:rFonts w:ascii="Cambria Math" w:hAnsi="Cambria Math" w:cs="Times New Roman"/>
                       <w:lang w:val="en-US"/>
                     </w:rPr>
-                    <m:t>2</m:t>
-                  </m:r>
-                  <m:r>
-                    <w:rPr>
-                      <w:rFonts w:ascii="Cambria Math" w:hAnsi="Cambria Math" w:cs="Times New Roman"/>
-                      <w:lang w:val="en-US"/>
-                    </w:rPr>
-                    <m:t>L</m:t>
+                    <m:t>2L</m:t>
                   </m:r>
                 </m:den>
               </m:f>
@@ -4587,14 +5298,17 @@
     <w:p>
       <w:pPr>
         <w:spacing w:line="360" w:lineRule="auto"/>
-        <w:rPr>
-          <w:rFonts w:ascii="Times New Roman" w:eastAsiaTheme="minorEastAsia" w:hAnsi="Times New Roman" w:cs="Times New Roman"/>
+        <w:jc w:val="both"/>
+        <w:rPr>
+          <w:rFonts w:ascii="Times New Roman" w:eastAsiaTheme="minorEastAsia" w:hAnsi="Times New Roman" w:cs="Times New Roman"/>
+          <w:i/>
         </w:rPr>
       </w:pPr>
       <w:r>
         <w:rPr>
           <w:rFonts w:ascii="Times New Roman" w:eastAsiaTheme="minorEastAsia" w:hAnsi="Times New Roman" w:cs="Times New Roman"/>
         </w:rPr>
+        <w:lastRenderedPageBreak/>
         <w:t>г</w:t>
       </w:r>
       <w:r>
@@ -4608,130 +5322,701 @@
           <w:rFonts w:ascii="Times New Roman" w:eastAsiaTheme="minorEastAsia" w:hAnsi="Times New Roman" w:cs="Times New Roman"/>
         </w:rPr>
         <w:t xml:space="preserve"> </w:t>
+      </w:r>
+      <m:oMath>
+        <m:sSub>
+          <m:sSubPr>
+            <m:ctrlPr>
+              <w:rPr>
+                <w:rFonts w:ascii="Cambria Math" w:hAnsi="Cambria Math" w:cs="Times New Roman"/>
+                <w:i/>
+                <w:lang w:val="en-US"/>
+              </w:rPr>
+            </m:ctrlPr>
+          </m:sSubPr>
+          <m:e>
+            <m:r>
+              <w:rPr>
+                <w:rFonts w:ascii="Cambria Math" w:hAnsi="Cambria Math" w:cs="Times New Roman"/>
+                <w:lang w:val="en-US"/>
+              </w:rPr>
+              <m:t>γ</m:t>
+            </m:r>
+          </m:e>
+          <m:sub>
+            <m:r>
+              <w:rPr>
+                <w:rFonts w:ascii="Cambria Math" w:hAnsi="Cambria Math" w:cs="Times New Roman"/>
+                <w:lang w:val="en-US"/>
+              </w:rPr>
+              <m:t>s</m:t>
+            </m:r>
+          </m:sub>
+        </m:sSub>
+      </m:oMath>
+      <w:r>
+        <w:rPr>
+          <w:rFonts w:ascii="Times New Roman" w:eastAsiaTheme="minorEastAsia" w:hAnsi="Times New Roman" w:cs="Times New Roman"/>
+        </w:rPr>
+        <w:t xml:space="preserve"> – </w:t>
+      </w:r>
+      <w:r>
+        <w:rPr>
+          <w:rFonts w:ascii="Times New Roman" w:eastAsiaTheme="minorEastAsia" w:hAnsi="Times New Roman" w:cs="Times New Roman"/>
+        </w:rPr>
+        <w:t xml:space="preserve">Лоренц-фактор референсной частицы, </w:t>
+      </w:r>
+      <m:oMath>
+        <m:sSub>
+          <m:sSubPr>
+            <m:ctrlPr>
+              <w:rPr>
+                <w:rFonts w:ascii="Cambria Math" w:hAnsi="Cambria Math" w:cs="Times New Roman"/>
+                <w:lang w:val="en-US"/>
+              </w:rPr>
+            </m:ctrlPr>
+          </m:sSubPr>
+          <m:e>
+            <m:r>
+              <w:rPr>
+                <w:rFonts w:ascii="Cambria Math" w:hAnsi="Cambria Math" w:cs="Times New Roman"/>
+                <w:lang w:val="en-US"/>
+              </w:rPr>
+              <m:t>α</m:t>
+            </m:r>
+          </m:e>
+          <m:sub>
+            <m:r>
+              <w:rPr>
+                <w:rFonts w:ascii="Cambria Math" w:hAnsi="Cambria Math" w:cs="Times New Roman"/>
+              </w:rPr>
+              <m:t>0</m:t>
+            </m:r>
+          </m:sub>
+        </m:sSub>
+        <m:r>
+          <w:rPr>
+            <w:rFonts w:ascii="Cambria Math" w:hAnsi="Cambria Math" w:cs="Times New Roman"/>
+          </w:rPr>
+          <m:t xml:space="preserve">, </m:t>
+        </m:r>
+        <m:sSub>
+          <m:sSubPr>
+            <m:ctrlPr>
+              <w:rPr>
+                <w:rFonts w:ascii="Cambria Math" w:hAnsi="Cambria Math" w:cs="Times New Roman"/>
+                <w:lang w:val="en-US"/>
+              </w:rPr>
+            </m:ctrlPr>
+          </m:sSubPr>
+          <m:e>
+            <m:r>
+              <w:rPr>
+                <w:rFonts w:ascii="Cambria Math" w:hAnsi="Cambria Math" w:cs="Times New Roman"/>
+                <w:lang w:val="en-US"/>
+              </w:rPr>
+              <m:t>α</m:t>
+            </m:r>
+          </m:e>
+          <m:sub>
+            <m:r>
+              <w:rPr>
+                <w:rFonts w:ascii="Cambria Math" w:hAnsi="Cambria Math" w:cs="Times New Roman"/>
+              </w:rPr>
+              <m:t>1</m:t>
+            </m:r>
+          </m:sub>
+        </m:sSub>
+      </m:oMath>
+      <w:r>
+        <w:rPr>
+          <w:rFonts w:ascii="Times New Roman" w:eastAsiaTheme="minorEastAsia" w:hAnsi="Times New Roman" w:cs="Times New Roman"/>
+        </w:rPr>
+        <w:t xml:space="preserve"> – первый и второй порядок разложения коэффициента уплотнения орбиты, </w:t>
+      </w:r>
+      <m:oMath>
+        <m:sSub>
+          <m:sSubPr>
+            <m:ctrlPr>
+              <w:rPr>
+                <w:rFonts w:ascii="Cambria Math" w:hAnsi="Cambria Math" w:cs="Times New Roman"/>
+                <w:i/>
+                <w:lang w:val="en-US"/>
+              </w:rPr>
+            </m:ctrlPr>
+          </m:sSubPr>
+          <m:e>
+            <m:r>
+              <w:rPr>
+                <w:rFonts w:ascii="Cambria Math" w:hAnsi="Cambria Math" w:cs="Times New Roman"/>
+                <w:lang w:val="en-US"/>
+              </w:rPr>
+              <m:t>δ</m:t>
+            </m:r>
+          </m:e>
+          <m:sub>
+            <m:r>
+              <w:rPr>
+                <w:rFonts w:ascii="Cambria Math" w:hAnsi="Cambria Math" w:cs="Times New Roman"/>
+              </w:rPr>
+              <m:t>0</m:t>
+            </m:r>
+          </m:sub>
+        </m:sSub>
+      </m:oMath>
+      <w:r>
+        <w:rPr>
+          <w:rFonts w:ascii="Times New Roman" w:eastAsiaTheme="minorEastAsia" w:hAnsi="Times New Roman" w:cs="Times New Roman"/>
+        </w:rPr>
+        <w:t xml:space="preserve"> – </w:t>
+      </w:r>
+      <w:r>
+        <w:rPr>
+          <w:rFonts w:ascii="Times New Roman" w:eastAsiaTheme="minorEastAsia" w:hAnsi="Times New Roman" w:cs="Times New Roman"/>
+        </w:rPr>
+        <w:t>разброс по импульсу</w:t>
+      </w:r>
+      <w:r>
+        <w:rPr>
+          <w:rFonts w:ascii="Times New Roman" w:eastAsiaTheme="minorEastAsia" w:hAnsi="Times New Roman" w:cs="Times New Roman"/>
+        </w:rPr>
+        <w:t xml:space="preserve">, </w:t>
+      </w:r>
+      <m:oMath>
+        <m:r>
+          <w:rPr>
+            <w:rFonts w:ascii="Cambria Math" w:hAnsi="Cambria Math" w:cs="Times New Roman"/>
+            <w:lang w:val="en-US"/>
+          </w:rPr>
+          <m:t>L</m:t>
+        </m:r>
+      </m:oMath>
+      <w:r>
+        <w:rPr>
+          <w:rFonts w:ascii="Times New Roman" w:eastAsiaTheme="minorEastAsia" w:hAnsi="Times New Roman" w:cs="Times New Roman"/>
+        </w:rPr>
+        <w:t xml:space="preserve"> – длина ускорителя, </w:t>
+      </w:r>
+      <m:oMath>
+        <m:sSub>
+          <m:sSubPr>
+            <m:ctrlPr>
+              <w:rPr>
+                <w:rFonts w:ascii="Cambria Math" w:eastAsiaTheme="minorEastAsia" w:hAnsi="Cambria Math" w:cs="Times New Roman"/>
+                <w:i/>
+              </w:rPr>
+            </m:ctrlPr>
+          </m:sSubPr>
+          <m:e>
+            <m:r>
+              <w:rPr>
+                <w:rFonts w:ascii="Cambria Math" w:eastAsiaTheme="minorEastAsia" w:hAnsi="Cambria Math" w:cs="Times New Roman"/>
+              </w:rPr>
+              <m:t>ν</m:t>
+            </m:r>
+          </m:e>
+          <m:sub>
+            <m:r>
+              <w:rPr>
+                <w:rFonts w:ascii="Cambria Math" w:eastAsiaTheme="minorEastAsia" w:hAnsi="Cambria Math" w:cs="Times New Roman"/>
+                <w:lang w:val="en-US"/>
+              </w:rPr>
+              <m:t>x</m:t>
+            </m:r>
+          </m:sub>
+        </m:sSub>
+        <m:r>
+          <w:rPr>
+            <w:rFonts w:ascii="Cambria Math" w:eastAsiaTheme="minorEastAsia" w:hAnsi="Cambria Math" w:cs="Times New Roman"/>
+          </w:rPr>
+          <m:t xml:space="preserve">, </m:t>
+        </m:r>
+        <m:sSub>
+          <m:sSubPr>
+            <m:ctrlPr>
+              <w:rPr>
+                <w:rFonts w:ascii="Cambria Math" w:eastAsiaTheme="minorEastAsia" w:hAnsi="Cambria Math" w:cs="Times New Roman"/>
+                <w:i/>
+              </w:rPr>
+            </m:ctrlPr>
+          </m:sSubPr>
+          <m:e>
+            <m:r>
+              <w:rPr>
+                <w:rFonts w:ascii="Cambria Math" w:eastAsiaTheme="minorEastAsia" w:hAnsi="Cambria Math" w:cs="Times New Roman"/>
+              </w:rPr>
+              <m:t>ν</m:t>
+            </m:r>
+          </m:e>
+          <m:sub>
+            <m:r>
+              <w:rPr>
+                <w:rFonts w:ascii="Cambria Math" w:eastAsiaTheme="minorEastAsia" w:hAnsi="Cambria Math" w:cs="Times New Roman"/>
+                <w:lang w:val="en-US"/>
+              </w:rPr>
+              <m:t>y</m:t>
+            </m:r>
+          </m:sub>
+        </m:sSub>
+      </m:oMath>
+      <w:r>
+        <w:rPr>
+          <w:rFonts w:ascii="Times New Roman" w:eastAsiaTheme="minorEastAsia" w:hAnsi="Times New Roman" w:cs="Times New Roman"/>
+        </w:rPr>
+        <w:t xml:space="preserve"> – </w:t>
+      </w:r>
+      <w:r>
+        <w:rPr>
+          <w:rFonts w:ascii="Times New Roman" w:eastAsiaTheme="minorEastAsia" w:hAnsi="Times New Roman" w:cs="Times New Roman"/>
+        </w:rPr>
+        <w:t>частота бетатронных колебаний.</w:t>
+      </w:r>
+      <w:r>
+        <w:rPr>
+          <w:rFonts w:ascii="Times New Roman" w:eastAsiaTheme="minorEastAsia" w:hAnsi="Times New Roman" w:cs="Times New Roman"/>
+          <w:i/>
+        </w:rPr>
+        <w:t xml:space="preserve"> </w:t>
+      </w:r>
+      <w:r>
+        <w:rPr>
+          <w:rFonts w:ascii="Times New Roman" w:eastAsiaTheme="minorEastAsia" w:hAnsi="Times New Roman" w:cs="Times New Roman"/>
+        </w:rPr>
+        <w:t>Приведенное уравнение показывает необходимость использования 3-х</w:t>
+      </w:r>
+      <w:r>
+        <w:rPr>
+          <w:rFonts w:ascii="Times New Roman" w:eastAsiaTheme="minorEastAsia" w:hAnsi="Times New Roman" w:cs="Times New Roman"/>
+        </w:rPr>
+        <w:t xml:space="preserve"> независимых</w:t>
+      </w:r>
+      <w:r>
+        <w:rPr>
+          <w:rFonts w:ascii="Times New Roman" w:eastAsiaTheme="minorEastAsia" w:hAnsi="Times New Roman" w:cs="Times New Roman"/>
+        </w:rPr>
+        <w:t xml:space="preserve"> семейств секступоле</w:t>
+      </w:r>
+      <w:r>
+        <w:rPr>
+          <w:rFonts w:ascii="Times New Roman" w:eastAsiaTheme="minorEastAsia" w:hAnsi="Times New Roman" w:cs="Times New Roman"/>
+        </w:rPr>
+        <w:t>й</w:t>
+      </w:r>
+      <w:r>
+        <w:rPr>
+          <w:rFonts w:ascii="Times New Roman" w:eastAsiaTheme="minorEastAsia" w:hAnsi="Times New Roman" w:cs="Times New Roman"/>
+        </w:rPr>
+        <w:t xml:space="preserve"> </w:t>
+      </w:r>
+      <w:r>
+        <w:rPr>
+          <w:rFonts w:ascii="Times New Roman" w:eastAsiaTheme="minorEastAsia" w:hAnsi="Times New Roman" w:cs="Times New Roman"/>
+        </w:rPr>
+        <w:t xml:space="preserve">для </w:t>
+      </w:r>
+      <w:r>
+        <w:rPr>
+          <w:rFonts w:ascii="Times New Roman" w:eastAsiaTheme="minorEastAsia" w:hAnsi="Times New Roman" w:cs="Times New Roman"/>
+        </w:rPr>
+        <w:t xml:space="preserve">коррекции удлинения орбиты вследствие </w:t>
+      </w:r>
+      <w:r>
+        <w:rPr>
+          <w:rFonts w:ascii="Times New Roman" w:eastAsiaTheme="minorEastAsia" w:hAnsi="Times New Roman" w:cs="Times New Roman"/>
+        </w:rPr>
+        <w:t>продольного и</w:t>
+      </w:r>
+      <w:r>
+        <w:rPr>
+          <w:rFonts w:ascii="Times New Roman" w:eastAsiaTheme="minorEastAsia" w:hAnsi="Times New Roman" w:cs="Times New Roman"/>
+        </w:rPr>
+        <w:t xml:space="preserve"> </w:t>
+      </w:r>
+      <w:r>
+        <w:rPr>
+          <w:rFonts w:ascii="Times New Roman" w:eastAsiaTheme="minorEastAsia" w:hAnsi="Times New Roman" w:cs="Times New Roman"/>
+        </w:rPr>
+        <w:t>бетатронного движения</w:t>
+      </w:r>
+      <w:r>
+        <w:rPr>
+          <w:rFonts w:ascii="Times New Roman" w:eastAsiaTheme="minorEastAsia" w:hAnsi="Times New Roman" w:cs="Times New Roman"/>
+        </w:rPr>
+        <w:t>.</w:t>
+      </w:r>
+      <w:r>
+        <w:rPr>
+          <w:rFonts w:ascii="Times New Roman" w:eastAsiaTheme="minorEastAsia" w:hAnsi="Times New Roman" w:cs="Times New Roman"/>
+        </w:rPr>
+        <w:t xml:space="preserve"> Для этого одно семейство должно быть установлено в места максимума дисперсионной функции для коррекции</w:t>
+      </w:r>
+      <w:r>
+        <w:rPr>
+          <w:rFonts w:ascii="Times New Roman" w:eastAsiaTheme="minorEastAsia" w:hAnsi="Times New Roman" w:cs="Times New Roman"/>
+        </w:rPr>
+        <w:t xml:space="preserve"> </w:t>
+      </w:r>
+      <w:r>
+        <w:rPr>
+          <w:rFonts w:ascii="Times New Roman" w:eastAsiaTheme="minorEastAsia" w:hAnsi="Times New Roman" w:cs="Times New Roman"/>
+        </w:rPr>
+        <w:t>второго порядка коэффициента уплотнения орбиты</w:t>
+      </w:r>
+      <w:r>
+        <w:rPr>
+          <w:rFonts w:ascii="Times New Roman" w:eastAsiaTheme="minorEastAsia" w:hAnsi="Times New Roman" w:cs="Times New Roman"/>
+        </w:rPr>
+        <w:t xml:space="preserve">. Другие два семейства располагаются в места максимумов </w:t>
+      </w:r>
+      <m:oMath>
+        <m:r>
+          <w:rPr>
+            <w:rFonts w:ascii="Cambria Math" w:hAnsi="Cambria Math" w:cs="Times New Roman"/>
+            <w:lang w:val="en-US"/>
+          </w:rPr>
+          <m:t>β</m:t>
+        </m:r>
+      </m:oMath>
+      <w:r>
+        <w:rPr>
+          <w:rFonts w:ascii="Times New Roman" w:eastAsiaTheme="minorEastAsia" w:hAnsi="Times New Roman" w:cs="Times New Roman"/>
+        </w:rPr>
+        <w:t>-функции</w:t>
+      </w:r>
+      <w:r>
+        <w:rPr>
+          <w:rFonts w:ascii="Times New Roman" w:eastAsiaTheme="minorEastAsia" w:hAnsi="Times New Roman" w:cs="Times New Roman"/>
+        </w:rPr>
+        <w:t xml:space="preserve"> </w:t>
+      </w:r>
+      <w:r>
+        <w:rPr>
+          <w:rFonts w:ascii="Times New Roman" w:eastAsiaTheme="minorEastAsia" w:hAnsi="Times New Roman" w:cs="Times New Roman"/>
+        </w:rPr>
+        <w:t>для коррекции хроматичности</w:t>
+      </w:r>
+      <w:r>
+        <w:rPr>
+          <w:rFonts w:ascii="Times New Roman" w:eastAsiaTheme="minorEastAsia" w:hAnsi="Times New Roman" w:cs="Times New Roman"/>
+        </w:rPr>
+        <w:t>.</w:t>
+      </w:r>
+      <w:r>
+        <w:rPr>
+          <w:rFonts w:ascii="Times New Roman" w:eastAsiaTheme="minorEastAsia" w:hAnsi="Times New Roman" w:cs="Times New Roman"/>
+        </w:rPr>
+        <w:t xml:space="preserve"> В</w:t>
+      </w:r>
+      <w:r>
+        <w:rPr>
+          <w:rFonts w:ascii="Times New Roman" w:eastAsiaTheme="minorEastAsia" w:hAnsi="Times New Roman" w:cs="Times New Roman"/>
+        </w:rPr>
+        <w:t xml:space="preserve"> случае кольца в форме 8 существуют предположения, указывающее на высокое время когерентности априори</w:t>
+      </w:r>
+      <w:r>
+        <w:rPr>
+          <w:rFonts w:ascii="Times New Roman" w:eastAsiaTheme="minorEastAsia" w:hAnsi="Times New Roman" w:cs="Times New Roman"/>
+        </w:rPr>
+        <w:t>,</w:t>
+      </w:r>
+      <w:r>
+        <w:rPr>
+          <w:rFonts w:ascii="Times New Roman" w:eastAsiaTheme="minorEastAsia" w:hAnsi="Times New Roman" w:cs="Times New Roman"/>
+        </w:rPr>
+        <w:t xml:space="preserve"> без </w:t>
+      </w:r>
+      <w:r>
+        <w:rPr>
+          <w:rFonts w:ascii="Times New Roman" w:eastAsiaTheme="minorEastAsia" w:hAnsi="Times New Roman" w:cs="Times New Roman"/>
+        </w:rPr>
+        <w:t>введения</w:t>
+      </w:r>
+      <w:r>
+        <w:rPr>
+          <w:rFonts w:ascii="Times New Roman" w:eastAsiaTheme="minorEastAsia" w:hAnsi="Times New Roman" w:cs="Times New Roman"/>
+        </w:rPr>
+        <w:t xml:space="preserve"> секступолей</w:t>
+      </w:r>
+      <w:r>
+        <w:rPr>
+          <w:rFonts w:ascii="Times New Roman" w:eastAsiaTheme="minorEastAsia" w:hAnsi="Times New Roman" w:cs="Times New Roman"/>
+        </w:rPr>
+        <w:t xml:space="preserve"> []</w:t>
+      </w:r>
+      <w:r>
+        <w:rPr>
+          <w:rFonts w:ascii="Times New Roman" w:eastAsiaTheme="minorEastAsia" w:hAnsi="Times New Roman" w:cs="Times New Roman"/>
+        </w:rPr>
+        <w:t>.</w:t>
+      </w:r>
+      <w:r>
+        <w:rPr>
+          <w:rFonts w:ascii="Times New Roman" w:eastAsiaTheme="minorEastAsia" w:hAnsi="Times New Roman" w:cs="Times New Roman"/>
+        </w:rPr>
+        <w:t xml:space="preserve"> </w:t>
+      </w:r>
+      <w:r>
+        <w:rPr>
+          <w:rFonts w:ascii="Times New Roman" w:eastAsiaTheme="minorEastAsia" w:hAnsi="Times New Roman" w:cs="Times New Roman"/>
+        </w:rPr>
+        <w:t>О</w:t>
+      </w:r>
+      <w:r>
+        <w:rPr>
+          <w:rFonts w:ascii="Times New Roman" w:eastAsiaTheme="minorEastAsia" w:hAnsi="Times New Roman" w:cs="Times New Roman"/>
+        </w:rPr>
+        <w:t>днако</w:t>
+      </w:r>
+      <w:r>
+        <w:rPr>
+          <w:rFonts w:ascii="Times New Roman" w:eastAsiaTheme="minorEastAsia" w:hAnsi="Times New Roman" w:cs="Times New Roman"/>
+        </w:rPr>
+        <w:t xml:space="preserve">, </w:t>
+      </w:r>
+      <w:r>
+        <w:rPr>
+          <w:rFonts w:ascii="Times New Roman" w:eastAsiaTheme="minorEastAsia" w:hAnsi="Times New Roman" w:cs="Times New Roman"/>
+        </w:rPr>
+        <w:t>использование сложной конфигурации полей</w:t>
+      </w:r>
+      <w:r>
+        <w:rPr>
+          <w:rFonts w:ascii="Times New Roman" w:eastAsiaTheme="minorEastAsia" w:hAnsi="Times New Roman" w:cs="Times New Roman"/>
+        </w:rPr>
+        <w:t xml:space="preserve"> для накопления ЭДМ-сигнала</w:t>
+      </w:r>
+      <w:r>
+        <w:rPr>
+          <w:rFonts w:ascii="Times New Roman" w:eastAsiaTheme="minorEastAsia" w:hAnsi="Times New Roman" w:cs="Times New Roman"/>
+        </w:rPr>
+        <w:t xml:space="preserve"> с применением как фильтров Вина, так и соленоидов, потребует соответствующей секступольной коррекции</w:t>
+      </w:r>
+      <w:r>
+        <w:rPr>
+          <w:rFonts w:ascii="Times New Roman" w:eastAsiaTheme="minorEastAsia" w:hAnsi="Times New Roman" w:cs="Times New Roman"/>
+        </w:rPr>
+        <w:t>.</w:t>
+      </w:r>
+      <w:r>
+        <w:rPr>
+          <w:rFonts w:ascii="Times New Roman" w:eastAsiaTheme="minorEastAsia" w:hAnsi="Times New Roman" w:cs="Times New Roman"/>
+        </w:rPr>
+        <w:t xml:space="preserve"> </w:t>
+      </w:r>
+      <w:r>
+        <w:rPr>
+          <w:rFonts w:ascii="Times New Roman" w:eastAsiaTheme="minorEastAsia" w:hAnsi="Times New Roman" w:cs="Times New Roman"/>
+        </w:rPr>
+        <w:t>В приведенной реализации</w:t>
+      </w:r>
+      <w:r>
+        <w:rPr>
+          <w:rFonts w:ascii="Times New Roman" w:eastAsiaTheme="minorEastAsia" w:hAnsi="Times New Roman" w:cs="Times New Roman"/>
+        </w:rPr>
+        <w:t xml:space="preserve"> на Рис. </w:t>
+      </w:r>
+      <w:r>
+        <w:rPr>
+          <w:rFonts w:ascii="Times New Roman" w:eastAsiaTheme="minorEastAsia" w:hAnsi="Times New Roman" w:cs="Times New Roman"/>
+        </w:rPr>
+        <w:t>5</w:t>
+      </w:r>
+      <w:r>
+        <w:rPr>
+          <w:rFonts w:ascii="Times New Roman" w:eastAsiaTheme="minorEastAsia" w:hAnsi="Times New Roman" w:cs="Times New Roman"/>
+        </w:rPr>
+        <w:t xml:space="preserve"> приведена регулярная арка с набегом фазы равным </w:t>
+      </w:r>
+      <m:oMath>
+        <m:r>
+          <w:rPr>
+            <w:rFonts w:ascii="Cambria Math" w:eastAsiaTheme="minorEastAsia" w:hAnsi="Cambria Math" w:cs="Times New Roman"/>
+          </w:rPr>
+          <m:t>3</m:t>
+        </m:r>
+        <m:r>
+          <w:rPr>
+            <w:rFonts w:ascii="Cambria Math" w:eastAsiaTheme="minorEastAsia" w:hAnsi="Cambria Math" w:cs="Times New Roman"/>
+          </w:rPr>
+          <m:t>×2π</m:t>
+        </m:r>
+      </m:oMath>
+      <w:r>
+        <w:rPr>
+          <w:rFonts w:ascii="Times New Roman" w:eastAsiaTheme="minorEastAsia" w:hAnsi="Times New Roman" w:cs="Times New Roman"/>
+        </w:rPr>
+        <w:t>, что обеспечивает подавление дисперсии на краях арки.</w:t>
+      </w:r>
+      <w:r>
+        <w:rPr>
+          <w:rFonts w:ascii="Times New Roman" w:eastAsiaTheme="minorEastAsia" w:hAnsi="Times New Roman" w:cs="Times New Roman"/>
+          <w:i/>
+        </w:rPr>
+        <w:tab/>
       </w:r>
     </w:p>
     <w:p>
       <w:pPr>
         <w:spacing w:line="360" w:lineRule="auto"/>
-        <w:rPr>
-          <w:rFonts w:ascii="Times New Roman" w:eastAsiaTheme="minorEastAsia" w:hAnsi="Times New Roman" w:cs="Times New Roman"/>
+        <w:jc w:val="both"/>
+        <w:rPr>
+          <w:rFonts w:ascii="Times New Roman" w:eastAsiaTheme="majorEastAsia" w:hAnsi="Times New Roman" w:cs="Times New Roman"/>
+          <w:color w:val="2F5496" w:themeColor="accent1" w:themeShade="BF"/>
+          <w:sz w:val="32"/>
+          <w:szCs w:val="32"/>
         </w:rPr>
       </w:pPr>
       <w:r>
         <w:rPr>
-          <w:rFonts w:ascii="Times New Roman" w:eastAsiaTheme="minorEastAsia" w:hAnsi="Times New Roman" w:cs="Times New Roman"/>
-        </w:rPr>
-        <w:t>Приведенное уравнение показывает необходимость использования 3-х семейств секступоле</w:t>
-      </w:r>
-      <w:r>
-        <w:rPr>
-          <w:rFonts w:ascii="Times New Roman" w:eastAsiaTheme="minorEastAsia" w:hAnsi="Times New Roman" w:cs="Times New Roman"/>
-        </w:rPr>
-        <w:t>й</w:t>
-      </w:r>
-      <w:r>
-        <w:rPr>
-          <w:rFonts w:ascii="Times New Roman" w:eastAsiaTheme="minorEastAsia" w:hAnsi="Times New Roman" w:cs="Times New Roman"/>
-        </w:rPr>
-        <w:t xml:space="preserve"> </w:t>
-      </w:r>
-      <w:r>
-        <w:rPr>
-          <w:rFonts w:ascii="Times New Roman" w:eastAsiaTheme="minorEastAsia" w:hAnsi="Times New Roman" w:cs="Times New Roman"/>
-        </w:rPr>
-        <w:t>для подавления коэффициента уплотнения орбиты и хроматичности в обеих плоскостях.</w:t>
-      </w:r>
-      <w:r>
-        <w:rPr>
-          <w:rFonts w:ascii="Times New Roman" w:eastAsiaTheme="minorEastAsia" w:hAnsi="Times New Roman" w:cs="Times New Roman"/>
-        </w:rPr>
-        <w:t xml:space="preserve"> В</w:t>
-      </w:r>
-      <w:r>
-        <w:rPr>
-          <w:rFonts w:ascii="Times New Roman" w:eastAsiaTheme="minorEastAsia" w:hAnsi="Times New Roman" w:cs="Times New Roman"/>
-        </w:rPr>
-        <w:t xml:space="preserve"> случае кольца в форме 8 существуют предположения, указывающее на высокое время когерентности априори</w:t>
-      </w:r>
-      <w:r>
-        <w:rPr>
-          <w:rFonts w:ascii="Times New Roman" w:eastAsiaTheme="minorEastAsia" w:hAnsi="Times New Roman" w:cs="Times New Roman"/>
-        </w:rPr>
-        <w:t>,</w:t>
-      </w:r>
-      <w:r>
-        <w:rPr>
-          <w:rFonts w:ascii="Times New Roman" w:eastAsiaTheme="minorEastAsia" w:hAnsi="Times New Roman" w:cs="Times New Roman"/>
-        </w:rPr>
-        <w:t xml:space="preserve"> без </w:t>
-      </w:r>
-      <w:r>
-        <w:rPr>
-          <w:rFonts w:ascii="Times New Roman" w:eastAsiaTheme="minorEastAsia" w:hAnsi="Times New Roman" w:cs="Times New Roman"/>
-        </w:rPr>
-        <w:t>введения</w:t>
-      </w:r>
-      <w:r>
-        <w:rPr>
-          <w:rFonts w:ascii="Times New Roman" w:eastAsiaTheme="minorEastAsia" w:hAnsi="Times New Roman" w:cs="Times New Roman"/>
-        </w:rPr>
-        <w:t xml:space="preserve"> секступолей.</w:t>
-      </w:r>
-      <w:r>
-        <w:rPr>
-          <w:rFonts w:ascii="Times New Roman" w:eastAsiaTheme="minorEastAsia" w:hAnsi="Times New Roman" w:cs="Times New Roman"/>
-        </w:rPr>
-        <w:t xml:space="preserve"> </w:t>
-      </w:r>
-      <w:r>
-        <w:rPr>
-          <w:rFonts w:ascii="Times New Roman" w:eastAsiaTheme="minorEastAsia" w:hAnsi="Times New Roman" w:cs="Times New Roman"/>
-        </w:rPr>
-        <w:t>В приведенной реализации</w:t>
-      </w:r>
-      <w:r>
-        <w:rPr>
-          <w:rFonts w:ascii="Times New Roman" w:eastAsiaTheme="minorEastAsia" w:hAnsi="Times New Roman" w:cs="Times New Roman"/>
-        </w:rPr>
-        <w:t xml:space="preserve"> на Рис. </w:t>
-      </w:r>
-      <w:r>
-        <w:rPr>
-          <w:rFonts w:ascii="Times New Roman" w:eastAsiaTheme="minorEastAsia" w:hAnsi="Times New Roman" w:cs="Times New Roman"/>
-        </w:rPr>
-        <w:t>?</w:t>
-      </w:r>
-      <w:r>
-        <w:rPr>
-          <w:rFonts w:ascii="Times New Roman" w:eastAsiaTheme="minorEastAsia" w:hAnsi="Times New Roman" w:cs="Times New Roman"/>
-        </w:rPr>
-        <w:t xml:space="preserve"> приведена регулярная арка с набегом фазы равным 3, что обеспечивает подавление дисперсии на краях арки. </w:t>
-      </w:r>
-    </w:p>
-    <w:p>
-      <w:pPr>
-        <w:spacing w:line="360" w:lineRule="auto"/>
-        <w:rPr>
-          <w:rFonts w:ascii="Times New Roman" w:eastAsiaTheme="minorEastAsia" w:hAnsi="Times New Roman" w:cs="Times New Roman"/>
-        </w:rPr>
-      </w:pPr>
-    </w:p>
-    <w:p>
-      <w:pPr>
-        <w:spacing w:line="360" w:lineRule="auto"/>
-        <w:rPr>
-          <w:rFonts w:ascii="Times New Roman" w:hAnsi="Times New Roman" w:cs="Times New Roman"/>
-        </w:rPr>
-      </w:pPr>
-      <w:r>
-        <w:rPr>
-          <w:rFonts w:ascii="Times New Roman" w:hAnsi="Times New Roman" w:cs="Times New Roman"/>
           <w:noProof/>
         </w:rPr>
+        <mc:AlternateContent>
+          <mc:Choice Requires="wps">
+            <w:drawing>
+              <wp:anchor distT="0" distB="0" distL="114300" distR="114300" simplePos="0" relativeHeight="251675648" behindDoc="0" locked="0" layoutInCell="1" allowOverlap="1" wp14:anchorId="731C328B" wp14:editId="411C6D83">
+                <wp:simplePos x="0" y="0"/>
+                <wp:positionH relativeFrom="column">
+                  <wp:posOffset>0</wp:posOffset>
+                </wp:positionH>
+                <wp:positionV relativeFrom="paragraph">
+                  <wp:posOffset>4329430</wp:posOffset>
+                </wp:positionV>
+                <wp:extent cx="5940425" cy="635"/>
+                <wp:effectExtent l="0" t="0" r="3175" b="12065"/>
+                <wp:wrapThrough wrapText="bothSides">
+                  <wp:wrapPolygon edited="0">
+                    <wp:start x="0" y="0"/>
+                    <wp:lineTo x="0" y="0"/>
+                    <wp:lineTo x="21565" y="0"/>
+                    <wp:lineTo x="21565" y="0"/>
+                    <wp:lineTo x="0" y="0"/>
+                  </wp:wrapPolygon>
+                </wp:wrapThrough>
+                <wp:docPr id="60854902" name="Надпись 1"/>
+                <wp:cNvGraphicFramePr/>
+                <a:graphic xmlns:a="http://schemas.openxmlformats.org/drawingml/2006/main">
+                  <a:graphicData uri="http://schemas.microsoft.com/office/word/2010/wordprocessingShape">
+                    <wps:wsp>
+                      <wps:cNvSpPr txBox="1"/>
+                      <wps:spPr>
+                        <a:xfrm>
+                          <a:off x="0" y="0"/>
+                          <a:ext cx="5940425" cy="635"/>
+                        </a:xfrm>
+                        <a:prstGeom prst="rect">
+                          <a:avLst/>
+                        </a:prstGeom>
+                        <a:solidFill>
+                          <a:prstClr val="white"/>
+                        </a:solidFill>
+                        <a:ln>
+                          <a:noFill/>
+                        </a:ln>
+                      </wps:spPr>
+                      <wps:txbx>
+                        <w:txbxContent>
+                          <w:p>
+                            <w:pPr>
+                              <w:pStyle w:val="a7"/>
+                              <w:rPr>
+                                <w:rFonts w:ascii="Times New Roman" w:hAnsi="Times New Roman" w:cs="Times New Roman"/>
+                                <w:noProof/>
+                                <w:sz w:val="22"/>
+                                <w:szCs w:val="22"/>
+                              </w:rPr>
+                            </w:pPr>
+                            <w:r>
+                              <w:t xml:space="preserve">Рис. 5 </w:t>
+                            </w:r>
+                            <w:proofErr w:type="spellStart"/>
+                            <w:r>
+                              <w:t>Твисс</w:t>
+                            </w:r>
+                            <w:proofErr w:type="spellEnd"/>
+                            <w:r>
+                              <w:t xml:space="preserve">-функции </w:t>
+                            </w:r>
+                            <w:r>
+                              <w:t xml:space="preserve">регулярной структуры, оптимизированной для проведения ЭДМ-эксперимента. </w:t>
+                            </w:r>
+                          </w:p>
+                        </w:txbxContent>
+                      </wps:txbx>
+                      <wps:bodyPr rot="0" spcFirstLastPara="0" vertOverflow="overflow" horzOverflow="overflow" vert="horz" wrap="square" lIns="0" tIns="0" rIns="0" bIns="0" numCol="1" spcCol="0" rtlCol="0" fromWordArt="0" anchor="t" anchorCtr="0" forceAA="0" compatLnSpc="1">
+                        <a:prstTxWarp prst="textNoShape">
+                          <a:avLst/>
+                        </a:prstTxWarp>
+                        <a:spAutoFit/>
+                      </wps:bodyPr>
+                    </wps:wsp>
+                  </a:graphicData>
+                </a:graphic>
+              </wp:anchor>
+            </w:drawing>
+          </mc:Choice>
+          <mc:Fallback>
+            <w:pict>
+              <v:shape w14:anchorId="731C328B" id="_x0000_s1030" type="#_x0000_t202" style="position:absolute;left:0;text-align:left;margin-left:0;margin-top:340.9pt;width:467.75pt;height:.05pt;z-index:251675648;visibility:visible;mso-wrap-style:square;mso-wrap-distance-left:9pt;mso-wrap-distance-top:0;mso-wrap-distance-right:9pt;mso-wrap-distance-bottom:0;mso-position-horizontal:absolute;mso-position-horizontal-relative:text;mso-position-vertical:absolute;mso-position-vertical-relative:text;v-text-anchor:top" o:gfxdata="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" stroked="f">
+                <v:textbox style="mso-fit-shape-to-text:t" inset="0,0,0,0">
+                  <w:txbxContent>
+                    <w:p>
+                      <w:pPr>
+                        <w:pStyle w:val="a7"/>
+                        <w:rPr>
+                          <w:rFonts w:ascii="Times New Roman" w:hAnsi="Times New Roman" w:cs="Times New Roman"/>
+                          <w:noProof/>
+                          <w:sz w:val="22"/>
+                          <w:szCs w:val="22"/>
+                        </w:rPr>
+                      </w:pPr>
+                      <w:r>
+                        <w:t xml:space="preserve">Рис. 5 </w:t>
+                      </w:r>
+                      <w:proofErr w:type="spellStart"/>
+                      <w:r>
+                        <w:t>Твисс</w:t>
+                      </w:r>
+                      <w:proofErr w:type="spellEnd"/>
+                      <w:r>
+                        <w:t xml:space="preserve">-функции </w:t>
+                      </w:r>
+                      <w:r>
+                        <w:t xml:space="preserve">регулярной структуры, оптимизированной для проведения ЭДМ-эксперимента. </w:t>
+                      </w:r>
+                    </w:p>
+                  </w:txbxContent>
+                </v:textbox>
+                <w10:wrap type="through"/>
+              </v:shape>
+            </w:pict>
+          </mc:Fallback>
+        </mc:AlternateContent>
+      </w:r>
+      <w:r>
+        <w:rPr>
+          <w:rFonts w:ascii="Times New Roman" w:hAnsi="Times New Roman" w:cs="Times New Roman"/>
+          <w:noProof/>
+        </w:rPr>
         <w:drawing>
-          <wp:inline distT="0" distB="0" distL="0" distR="0" wp14:anchorId="28EDCF45" wp14:editId="51099A10">
+          <wp:anchor distT="0" distB="0" distL="114300" distR="114300" simplePos="0" relativeHeight="251672576" behindDoc="0" locked="0" layoutInCell="1" allowOverlap="1" wp14:anchorId="1ED2B136" wp14:editId="58012863">
+            <wp:simplePos x="0" y="0"/>
+            <wp:positionH relativeFrom="column">
+              <wp:posOffset>0</wp:posOffset>
+            </wp:positionH>
+            <wp:positionV relativeFrom="paragraph">
+              <wp:posOffset>1436642</wp:posOffset>
+            </wp:positionV>
             <wp:extent cx="5940425" cy="2835910"/>
-            <wp:effectExtent l="0" t="0" r="3175" b="2540"/>
+            <wp:effectExtent l="0" t="0" r="3175" b="0"/>
+            <wp:wrapThrough wrapText="bothSides">
+              <wp:wrapPolygon edited="0">
+                <wp:start x="0" y="0"/>
+                <wp:lineTo x="0" y="21474"/>
+                <wp:lineTo x="21565" y="21474"/>
+                <wp:lineTo x="21565" y="0"/>
+                <wp:lineTo x="0" y="0"/>
+              </wp:wrapPolygon>
+            </wp:wrapThrough>
             <wp:docPr id="3" name="Рисунок 3"/>
             <wp:cNvGraphicFramePr>
               <a:graphicFrameLocks xmlns:a="http://schemas.openxmlformats.org/drawingml/2006/main" noChangeAspect="1"/>
@@ -4744,7 +6029,13 @@
                     <pic:cNvPicPr/>
                   </pic:nvPicPr>
                   <pic:blipFill>
-                    <a:blip r:embed="rId9"/>
+                    <a:blip r:embed="rId11">
+                      <a:extLst>
+                        <a:ext uri="{28A0092B-C50C-407E-A947-70E740481C1C}">
+                          <a14:useLocalDpi xmlns:a14="http://schemas.microsoft.com/office/drawing/2010/main" val="0"/>
+                        </a:ext>
+                      </a:extLst>
+                    </a:blip>
                     <a:stretch>
                       <a:fillRect/>
                     </a:stretch>
@@ -4761,162 +6052,116 @@
                 </pic:pic>
               </a:graphicData>
             </a:graphic>
-          </wp:inline>
+            <wp14:sizeRelH relativeFrom="page">
+              <wp14:pctWidth>0</wp14:pctWidth>
+            </wp14:sizeRelH>
+            <wp14:sizeRelV relativeFrom="page">
+              <wp14:pctHeight>0</wp14:pctHeight>
+            </wp14:sizeRelV>
+          </wp:anchor>
         </w:drawing>
+      </w:r>
+      <w:r>
+        <w:rPr>
+          <w:rFonts w:ascii="Times New Roman" w:hAnsi="Times New Roman" w:cs="Times New Roman"/>
+        </w:rPr>
+        <w:tab/>
+        <w:t>Кроме того, к</w:t>
+      </w:r>
+      <w:r>
+        <w:rPr>
+          <w:rFonts w:ascii="Times New Roman" w:hAnsi="Times New Roman" w:cs="Times New Roman"/>
+        </w:rPr>
+        <w:t>ольцо в форме 8 имеет ряд преимуществ для проведения экспериментов по поиску аксиона. Поскольку спин-</w:t>
+      </w:r>
+      <w:proofErr w:type="spellStart"/>
+      <w:r>
+        <w:rPr>
+          <w:rFonts w:ascii="Times New Roman" w:hAnsi="Times New Roman" w:cs="Times New Roman"/>
+        </w:rPr>
+        <w:t>тюн</w:t>
+      </w:r>
+      <w:proofErr w:type="spellEnd"/>
+      <w:r>
+        <w:rPr>
+          <w:rFonts w:ascii="Times New Roman" w:hAnsi="Times New Roman" w:cs="Times New Roman"/>
+        </w:rPr>
+        <w:t xml:space="preserve"> в первом </w:t>
+      </w:r>
+      <w:r>
+        <w:rPr>
+          <w:rFonts w:ascii="Times New Roman" w:hAnsi="Times New Roman" w:cs="Times New Roman"/>
+        </w:rPr>
+        <w:t>приближении</w:t>
+      </w:r>
+      <w:r>
+        <w:rPr>
+          <w:rFonts w:ascii="Times New Roman" w:hAnsi="Times New Roman" w:cs="Times New Roman"/>
+        </w:rPr>
+        <w:t xml:space="preserve"> имеет</w:t>
+      </w:r>
+      <w:r>
+        <w:rPr>
+          <w:rFonts w:ascii="Times New Roman" w:hAnsi="Times New Roman" w:cs="Times New Roman"/>
+        </w:rPr>
+        <w:t xml:space="preserve"> нулевое значение для любого сорта частиц и любой энергии, это открывает значительную перспективу использования протонного когерентного пучка в структуре кольца в форме 8 с фильтром Вина, задающим частоту </w:t>
+      </w:r>
+      <w:r>
+        <w:rPr>
+          <w:rFonts w:ascii="Times New Roman" w:hAnsi="Times New Roman" w:cs="Times New Roman"/>
+        </w:rPr>
+        <w:t>прецессии</w:t>
+      </w:r>
+      <w:r>
+        <w:rPr>
+          <w:rFonts w:ascii="Times New Roman" w:hAnsi="Times New Roman" w:cs="Times New Roman"/>
+        </w:rPr>
+        <w:t xml:space="preserve">. Таким образом кольцо будет использовано в качестве аксионной </w:t>
+      </w:r>
+      <w:r>
+        <w:rPr>
+          <w:rFonts w:ascii="Times New Roman" w:hAnsi="Times New Roman" w:cs="Times New Roman"/>
+        </w:rPr>
+        <w:t>антенны</w:t>
+      </w:r>
+      <w:r>
+        <w:rPr>
+          <w:rFonts w:ascii="Times New Roman" w:hAnsi="Times New Roman" w:cs="Times New Roman"/>
+        </w:rPr>
+        <w:t xml:space="preserve"> и могут быть исследованы аксионоподобные частицы низких масс.</w:t>
+      </w:r>
+      <w:r>
+        <w:rPr>
+          <w:rFonts w:ascii="Times New Roman" w:hAnsi="Times New Roman" w:cs="Times New Roman"/>
+        </w:rPr>
+        <w:br w:type="page"/>
       </w:r>
     </w:p>
     <w:p>
       <w:pPr>
+        <w:pStyle w:val="1"/>
         <w:spacing w:line="360" w:lineRule="auto"/>
+        <w:jc w:val="both"/>
         <w:rPr>
           <w:rFonts w:ascii="Times New Roman" w:hAnsi="Times New Roman" w:cs="Times New Roman"/>
         </w:rPr>
       </w:pPr>
+      <w:r>
+        <w:rPr>
+          <w:rFonts w:ascii="Times New Roman" w:hAnsi="Times New Roman" w:cs="Times New Roman"/>
+        </w:rPr>
+        <w:lastRenderedPageBreak/>
+        <w:t>Тяжелоионная опция</w:t>
+      </w:r>
     </w:p>
     <w:p>
       <w:pPr>
         <w:spacing w:line="360" w:lineRule="auto"/>
         <w:jc w:val="both"/>
         <w:rPr>
-          <w:rFonts w:ascii="Times New Roman" w:eastAsiaTheme="majorEastAsia" w:hAnsi="Times New Roman" w:cs="Times New Roman"/>
-          <w:color w:val="2F5496" w:themeColor="accent1" w:themeShade="BF"/>
-          <w:sz w:val="32"/>
-          <w:szCs w:val="32"/>
+          <w:rFonts w:ascii="Times New Roman" w:hAnsi="Times New Roman" w:cs="Times New Roman"/>
         </w:rPr>
       </w:pPr>
-      <w:r>
-        <w:rPr>
-          <w:rFonts w:ascii="Times New Roman" w:hAnsi="Times New Roman" w:cs="Times New Roman"/>
-        </w:rPr>
-        <w:lastRenderedPageBreak/>
-        <w:t xml:space="preserve">Кольцо в форме 8 имеет ряд преимуществ для проведения экспериментов по поиску аксиона. Поскольку спин-тюн в первом </w:t>
-      </w:r>
-      <w:r>
-        <w:rPr>
-          <w:rFonts w:ascii="Times New Roman" w:hAnsi="Times New Roman" w:cs="Times New Roman"/>
-        </w:rPr>
-        <w:t>приближении</w:t>
-      </w:r>
-      <w:r>
-        <w:rPr>
-          <w:rFonts w:ascii="Times New Roman" w:hAnsi="Times New Roman" w:cs="Times New Roman"/>
-        </w:rPr>
-        <w:t xml:space="preserve"> имеет</w:t>
-      </w:r>
-      <w:r>
-        <w:rPr>
-          <w:rFonts w:ascii="Times New Roman" w:hAnsi="Times New Roman" w:cs="Times New Roman"/>
-        </w:rPr>
-        <w:t xml:space="preserve"> нулевое значение для любого сорта частиц и любой энергии, это открывает значительную перспективу использования протонного когерентного пучка в структуре кольца в форме 8 с фильтром Вина, задающим частоту </w:t>
-      </w:r>
-      <w:r>
-        <w:rPr>
-          <w:rFonts w:ascii="Times New Roman" w:hAnsi="Times New Roman" w:cs="Times New Roman"/>
-        </w:rPr>
-        <w:t>прецессии</w:t>
-      </w:r>
-      <w:r>
-        <w:rPr>
-          <w:rFonts w:ascii="Times New Roman" w:hAnsi="Times New Roman" w:cs="Times New Roman"/>
-        </w:rPr>
-        <w:t xml:space="preserve">. Таким образом кольцо будет использовано в качестве аксионной </w:t>
-      </w:r>
-      <w:r>
-        <w:rPr>
-          <w:rFonts w:ascii="Times New Roman" w:hAnsi="Times New Roman" w:cs="Times New Roman"/>
-        </w:rPr>
-        <w:t>антенны</w:t>
-      </w:r>
-      <w:r>
-        <w:rPr>
-          <w:rFonts w:ascii="Times New Roman" w:hAnsi="Times New Roman" w:cs="Times New Roman"/>
-        </w:rPr>
-        <w:t xml:space="preserve"> и могут быть исследованы аксионоподобные частицы низких масс.</w:t>
-      </w:r>
-      <w:r>
-        <w:rPr>
-          <w:rFonts w:ascii="Times New Roman" w:hAnsi="Times New Roman" w:cs="Times New Roman"/>
-        </w:rPr>
-        <w:br w:type="page"/>
-      </w:r>
-    </w:p>
-    <w:p>
-      <w:pPr>
-        <w:pStyle w:val="1"/>
-        <w:spacing w:line="360" w:lineRule="auto"/>
-        <w:rPr>
-          <w:rFonts w:ascii="Times New Roman" w:hAnsi="Times New Roman" w:cs="Times New Roman"/>
-        </w:rPr>
-      </w:pPr>
-      <w:r>
-        <w:rPr>
-          <w:rFonts w:ascii="Times New Roman" w:hAnsi="Times New Roman" w:cs="Times New Roman"/>
-        </w:rPr>
-        <w:lastRenderedPageBreak/>
-        <w:t>Тяжелоионная опция</w:t>
-      </w:r>
-    </w:p>
-    <w:p>
-      <w:pPr>
-        <w:spacing w:line="360" w:lineRule="auto"/>
-        <w:rPr>
-          <w:rFonts w:ascii="Times New Roman" w:hAnsi="Times New Roman" w:cs="Times New Roman"/>
-        </w:rPr>
-      </w:pPr>
-      <w:r>
-        <w:rPr>
-          <w:rFonts w:ascii="Times New Roman" w:hAnsi="Times New Roman" w:cs="Times New Roman"/>
-          <w:noProof/>
-        </w:rPr>
-        <w:drawing>
-          <wp:inline distT="0" distB="0" distL="0" distR="0" wp14:anchorId="3F0A3DD6" wp14:editId="548C87AF">
-            <wp:extent cx="5940425" cy="2827020"/>
-            <wp:effectExtent l="0" t="0" r="3175" b="0"/>
-            <wp:docPr id="1" name="Рисунок 1"/>
-            <wp:cNvGraphicFramePr>
-              <a:graphicFrameLocks xmlns:a="http://schemas.openxmlformats.org/drawingml/2006/main" noChangeAspect="1"/>
-            </wp:cNvGraphicFramePr>
-            <a:graphic xmlns:a="http://schemas.openxmlformats.org/drawingml/2006/main">
-              <a:graphicData uri="http://schemas.openxmlformats.org/drawingml/2006/picture">
-                <pic:pic xmlns:pic="http://schemas.openxmlformats.org/drawingml/2006/picture">
-                  <pic:nvPicPr>
-                    <pic:cNvPr id="0" name="Picture 1"/>
-                    <pic:cNvPicPr>
-                      <a:picLocks noChangeAspect="1" noChangeArrowheads="1"/>
-                    </pic:cNvPicPr>
-                  </pic:nvPicPr>
-                  <pic:blipFill>
-                    <a:blip r:embed="rId10">
-                      <a:extLst>
-                        <a:ext uri="{28A0092B-C50C-407E-A947-70E740481C1C}">
-                          <a14:useLocalDpi xmlns:a14="http://schemas.microsoft.com/office/drawing/2010/main" val="0"/>
-                        </a:ext>
-                      </a:extLst>
-                    </a:blip>
-                    <a:srcRect/>
-                    <a:stretch>
-                      <a:fillRect/>
-                    </a:stretch>
-                  </pic:blipFill>
-                  <pic:spPr bwMode="auto">
-                    <a:xfrm>
-                      <a:off x="0" y="0"/>
-                      <a:ext cx="5940425" cy="2827020"/>
-                    </a:xfrm>
-                    <a:prstGeom prst="rect">
-                      <a:avLst/>
-                    </a:prstGeom>
-                    <a:noFill/>
-                    <a:ln>
-                      <a:noFill/>
-                    </a:ln>
-                  </pic:spPr>
-                </pic:pic>
-              </a:graphicData>
-            </a:graphic>
-          </wp:inline>
-        </w:drawing>
-      </w:r>
     </w:p>
     <w:p>
       <w:pPr>
@@ -5370,7 +6615,6 @@
                           <m:r>
                             <w:rPr>
                               <w:rFonts w:ascii="Cambria Math" w:eastAsiaTheme="minorEastAsia" w:hAnsi="Cambria Math" w:cs="Times New Roman"/>
-                              <w:lang w:val="en-US"/>
                             </w:rPr>
                             <m:t>2</m:t>
                           </m:r>
@@ -5379,7 +6623,6 @@
                       <m:r>
                         <w:rPr>
                           <w:rFonts w:ascii="Cambria Math" w:eastAsiaTheme="minorEastAsia" w:hAnsi="Cambria Math" w:cs="Times New Roman"/>
-                          <w:lang w:val="en-US"/>
                         </w:rPr>
                         <m:t>+</m:t>
                       </m:r>
@@ -5414,7 +6657,6 @@
                           <m:r>
                             <w:rPr>
                               <w:rFonts w:ascii="Cambria Math" w:eastAsiaTheme="minorEastAsia" w:hAnsi="Cambria Math" w:cs="Times New Roman"/>
-                              <w:lang w:val="en-US"/>
                             </w:rPr>
                             <m:t>2</m:t>
                           </m:r>
@@ -5451,7 +6693,6 @@
                           <m:r>
                             <w:rPr>
                               <w:rFonts w:ascii="Cambria Math" w:eastAsiaTheme="minorEastAsia" w:hAnsi="Cambria Math" w:cs="Times New Roman"/>
-                              <w:lang w:val="en-US"/>
                             </w:rPr>
                             <m:t>2</m:t>
                           </m:r>
@@ -6984,11 +8225,19 @@
         </w:rPr>
         <w:t xml:space="preserve">мым </w:t>
       </w:r>
-      <w:r>
-        <w:rPr>
-          <w:rFonts w:ascii="Times New Roman" w:hAnsi="Times New Roman" w:cs="Times New Roman"/>
-        </w:rPr>
-        <w:t xml:space="preserve">бездисперсионным </w:t>
+      <w:proofErr w:type="spellStart"/>
+      <w:r>
+        <w:rPr>
+          <w:rFonts w:ascii="Times New Roman" w:hAnsi="Times New Roman" w:cs="Times New Roman"/>
+        </w:rPr>
+        <w:t>бездисперсионным</w:t>
+      </w:r>
+      <w:proofErr w:type="spellEnd"/>
+      <w:r>
+        <w:rPr>
+          <w:rFonts w:ascii="Times New Roman" w:hAnsi="Times New Roman" w:cs="Times New Roman"/>
+        </w:rPr>
+        <w:t xml:space="preserve"> </w:t>
       </w:r>
       <w:r>
         <w:rPr>
@@ -7098,7 +8347,19 @@
         <w:rPr>
           <w:rFonts w:ascii="Times New Roman" w:hAnsi="Times New Roman" w:cs="Times New Roman"/>
         </w:rPr>
-        <w:t xml:space="preserve">о подавление дисперсии может быть осуществлено вариацией градиента в квадрупольных линзах 2-х или 3-х крайних ФОДО-ячейках. </w:t>
+        <w:t>о подавление дисперсии может быть осуществлено вариацией градиента в квадрупольных линзах 2-х или 3-х крайних</w:t>
+      </w:r>
+      <w:r>
+        <w:rPr>
+          <w:rFonts w:ascii="Times New Roman" w:hAnsi="Times New Roman" w:cs="Times New Roman"/>
+        </w:rPr>
+        <w:t xml:space="preserve"> </w:t>
+      </w:r>
+      <w:r>
+        <w:rPr>
+          <w:rFonts w:ascii="Times New Roman" w:hAnsi="Times New Roman" w:cs="Times New Roman"/>
+        </w:rPr>
+        <w:t>ячейках.</w:t>
       </w:r>
     </w:p>
     <w:p>
@@ -7111,9 +8372,198 @@
       </w:pPr>
       <w:r>
         <w:rPr>
-          <w:rFonts w:ascii="Times New Roman" w:hAnsi="Times New Roman" w:cs="Times New Roman"/>
+          <w:noProof/>
         </w:rPr>
         <w:lastRenderedPageBreak/>
+        <mc:AlternateContent>
+          <mc:Choice Requires="wps">
+            <w:drawing>
+              <wp:anchor distT="0" distB="0" distL="114300" distR="114300" simplePos="0" relativeHeight="251677696" behindDoc="0" locked="0" layoutInCell="1" allowOverlap="1" wp14:anchorId="17CFD9FB" wp14:editId="330C77C3">
+                <wp:simplePos x="0" y="0"/>
+                <wp:positionH relativeFrom="column">
+                  <wp:posOffset>-71755</wp:posOffset>
+                </wp:positionH>
+                <wp:positionV relativeFrom="paragraph">
+                  <wp:posOffset>4831080</wp:posOffset>
+                </wp:positionV>
+                <wp:extent cx="5940425" cy="369570"/>
+                <wp:effectExtent l="0" t="0" r="3175" b="0"/>
+                <wp:wrapTopAndBottom/>
+                <wp:docPr id="2044363959" name="Надпись 1"/>
+                <wp:cNvGraphicFramePr/>
+                <a:graphic xmlns:a="http://schemas.openxmlformats.org/drawingml/2006/main">
+                  <a:graphicData uri="http://schemas.microsoft.com/office/word/2010/wordprocessingShape">
+                    <wps:wsp>
+                      <wps:cNvSpPr txBox="1"/>
+                      <wps:spPr>
+                        <a:xfrm>
+                          <a:off x="0" y="0"/>
+                          <a:ext cx="5940425" cy="369570"/>
+                        </a:xfrm>
+                        <a:prstGeom prst="rect">
+                          <a:avLst/>
+                        </a:prstGeom>
+                        <a:solidFill>
+                          <a:prstClr val="white"/>
+                        </a:solidFill>
+                        <a:ln>
+                          <a:noFill/>
+                        </a:ln>
+                      </wps:spPr>
+                      <wps:txbx>
+                        <w:txbxContent>
+                          <w:p>
+                            <w:pPr>
+                              <w:pStyle w:val="a7"/>
+                              <w:rPr>
+                                <w:rFonts w:ascii="Times New Roman" w:hAnsi="Times New Roman" w:cs="Times New Roman"/>
+                                <w:noProof/>
+                                <w:sz w:val="22"/>
+                                <w:szCs w:val="22"/>
+                              </w:rPr>
+                            </w:pPr>
+                            <w:r>
+                              <w:t xml:space="preserve">Рис. 6 </w:t>
+                            </w:r>
+                            <w:proofErr w:type="spellStart"/>
+                            <w:r>
+                              <w:t>Твисс</w:t>
+                            </w:r>
+                            <w:proofErr w:type="spellEnd"/>
+                            <w:r>
+                              <w:t>-функции регулярной структуры, оптимизированной</w:t>
+                            </w:r>
+                            <w:r>
+                              <w:t xml:space="preserve"> для тяжелых ионов с точки зрения увеличения времени внутрипучкового рассеяния. </w:t>
+                            </w:r>
+                          </w:p>
+                        </w:txbxContent>
+                      </wps:txbx>
+                      <wps:bodyPr rot="0" spcFirstLastPara="0" vertOverflow="overflow" horzOverflow="overflow" vert="horz" wrap="square" lIns="0" tIns="0" rIns="0" bIns="0" numCol="1" spcCol="0" rtlCol="0" fromWordArt="0" anchor="t" anchorCtr="0" forceAA="0" compatLnSpc="1">
+                        <a:prstTxWarp prst="textNoShape">
+                          <a:avLst/>
+                        </a:prstTxWarp>
+                        <a:noAutofit/>
+                      </wps:bodyPr>
+                    </wps:wsp>
+                  </a:graphicData>
+                </a:graphic>
+                <wp14:sizeRelV relativeFrom="margin">
+                  <wp14:pctHeight>0</wp14:pctHeight>
+                </wp14:sizeRelV>
+              </wp:anchor>
+            </w:drawing>
+          </mc:Choice>
+          <mc:Fallback>
+            <w:pict>
+              <v:shape w14:anchorId="17CFD9FB" id="_x0000_s1031" type="#_x0000_t202" style="position:absolute;left:0;text-align:left;margin-left:-5.65pt;margin-top:380.4pt;width:467.75pt;height:29.1pt;z-index:251677696;visibility:visible;mso-wrap-style:square;mso-height-percent:0;mso-wrap-distance-left:9pt;mso-wrap-distance-top:0;mso-wrap-distance-right:9pt;mso-wrap-distance-bottom:0;mso-position-horizontal:absolute;mso-position-horizontal-relative:text;mso-position-vertical:absolute;mso-position-vertical-relative:text;mso-height-percent:0;mso-height-relative:margin;v-text-anchor:top" o:gfxdata="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" stroked="f">
+                <v:textbox inset="0,0,0,0">
+                  <w:txbxContent>
+                    <w:p>
+                      <w:pPr>
+                        <w:pStyle w:val="a7"/>
+                        <w:rPr>
+                          <w:rFonts w:ascii="Times New Roman" w:hAnsi="Times New Roman" w:cs="Times New Roman"/>
+                          <w:noProof/>
+                          <w:sz w:val="22"/>
+                          <w:szCs w:val="22"/>
+                        </w:rPr>
+                      </w:pPr>
+                      <w:r>
+                        <w:t xml:space="preserve">Рис. 6 </w:t>
+                      </w:r>
+                      <w:proofErr w:type="spellStart"/>
+                      <w:r>
+                        <w:t>Твисс</w:t>
+                      </w:r>
+                      <w:proofErr w:type="spellEnd"/>
+                      <w:r>
+                        <w:t>-функции регулярной структуры, оптимизированной</w:t>
+                      </w:r>
+                      <w:r>
+                        <w:t xml:space="preserve"> для тяжелых ионов с точки зрения увеличения времени внутрипучкового рассеяния. </w:t>
+                      </w:r>
+                    </w:p>
+                  </w:txbxContent>
+                </v:textbox>
+                <w10:wrap type="topAndBottom"/>
+              </v:shape>
+            </w:pict>
+          </mc:Fallback>
+        </mc:AlternateContent>
+      </w:r>
+      <w:r>
+        <w:rPr>
+          <w:rFonts w:ascii="Times New Roman" w:hAnsi="Times New Roman" w:cs="Times New Roman"/>
+          <w:noProof/>
+        </w:rPr>
+        <w:drawing>
+          <wp:anchor distT="0" distB="0" distL="114300" distR="114300" simplePos="0" relativeHeight="251673600" behindDoc="0" locked="0" layoutInCell="1" allowOverlap="1" wp14:anchorId="538D414D" wp14:editId="13736D18">
+            <wp:simplePos x="0" y="0"/>
+            <wp:positionH relativeFrom="column">
+              <wp:posOffset>-60374</wp:posOffset>
+            </wp:positionH>
+            <wp:positionV relativeFrom="paragraph">
+              <wp:posOffset>1951892</wp:posOffset>
+            </wp:positionV>
+            <wp:extent cx="5940425" cy="2827020"/>
+            <wp:effectExtent l="0" t="0" r="3175" b="5080"/>
+            <wp:wrapTopAndBottom/>
+            <wp:docPr id="1" name="Рисунок 1"/>
+            <wp:cNvGraphicFramePr>
+              <a:graphicFrameLocks xmlns:a="http://schemas.openxmlformats.org/drawingml/2006/main" noChangeAspect="1"/>
+            </wp:cNvGraphicFramePr>
+            <a:graphic xmlns:a="http://schemas.openxmlformats.org/drawingml/2006/main">
+              <a:graphicData uri="http://schemas.openxmlformats.org/drawingml/2006/picture">
+                <pic:pic xmlns:pic="http://schemas.openxmlformats.org/drawingml/2006/picture">
+                  <pic:nvPicPr>
+                    <pic:cNvPr id="0" name="Picture 1"/>
+                    <pic:cNvPicPr>
+                      <a:picLocks noChangeAspect="1" noChangeArrowheads="1"/>
+                    </pic:cNvPicPr>
+                  </pic:nvPicPr>
+                  <pic:blipFill>
+                    <a:blip r:embed="rId12">
+                      <a:extLst>
+                        <a:ext uri="{28A0092B-C50C-407E-A947-70E740481C1C}">
+                          <a14:useLocalDpi xmlns:a14="http://schemas.microsoft.com/office/drawing/2010/main" val="0"/>
+                        </a:ext>
+                      </a:extLst>
+                    </a:blip>
+                    <a:srcRect/>
+                    <a:stretch>
+                      <a:fillRect/>
+                    </a:stretch>
+                  </pic:blipFill>
+                  <pic:spPr bwMode="auto">
+                    <a:xfrm>
+                      <a:off x="0" y="0"/>
+                      <a:ext cx="5940425" cy="2827020"/>
+                    </a:xfrm>
+                    <a:prstGeom prst="rect">
+                      <a:avLst/>
+                    </a:prstGeom>
+                    <a:noFill/>
+                    <a:ln>
+                      <a:noFill/>
+                    </a:ln>
+                  </pic:spPr>
+                </pic:pic>
+              </a:graphicData>
+            </a:graphic>
+            <wp14:sizeRelH relativeFrom="page">
+              <wp14:pctWidth>0</wp14:pctWidth>
+            </wp14:sizeRelH>
+            <wp14:sizeRelV relativeFrom="page">
+              <wp14:pctHeight>0</wp14:pctHeight>
+            </wp14:sizeRelV>
+          </wp:anchor>
+        </w:drawing>
+      </w:r>
+      <w:r>
+        <w:rPr>
+          <w:rFonts w:ascii="Times New Roman" w:hAnsi="Times New Roman" w:cs="Times New Roman"/>
+        </w:rPr>
         <w:t xml:space="preserve">Поскольку, </w:t>
       </w:r>
       <w:r>
@@ -7126,7 +8576,47 @@
         <w:rPr>
           <w:rFonts w:ascii="Times New Roman" w:hAnsi="Times New Roman" w:cs="Times New Roman"/>
         </w:rPr>
-        <w:t xml:space="preserve"> и будет рассмотрен второй указанный вариант подавления дисперсии. На Рис. ? показан принципиальный вид Твисс-параметров для тяжелоионной структуры. Ввиду неоптимальности выбранного способа подавления дисперсии, на краях арки возникают характерные максимумы, что в конечном счёте </w:t>
+        <w:t xml:space="preserve"> и будет рассмотрен второй указанный вариант подавления дисперсии. На Рис. </w:t>
+      </w:r>
+      <w:r>
+        <w:rPr>
+          <w:rFonts w:ascii="Times New Roman" w:hAnsi="Times New Roman" w:cs="Times New Roman"/>
+        </w:rPr>
+        <w:t>6</w:t>
+      </w:r>
+      <w:r>
+        <w:rPr>
+          <w:rFonts w:ascii="Times New Roman" w:hAnsi="Times New Roman" w:cs="Times New Roman"/>
+        </w:rPr>
+        <w:t xml:space="preserve"> показан принципиальный вид </w:t>
+      </w:r>
+      <w:proofErr w:type="spellStart"/>
+      <w:r>
+        <w:rPr>
+          <w:rFonts w:ascii="Times New Roman" w:hAnsi="Times New Roman" w:cs="Times New Roman"/>
+        </w:rPr>
+        <w:t>Твисс</w:t>
+      </w:r>
+      <w:proofErr w:type="spellEnd"/>
+      <w:r>
+        <w:rPr>
+          <w:rFonts w:ascii="Times New Roman" w:hAnsi="Times New Roman" w:cs="Times New Roman"/>
+        </w:rPr>
+        <w:t xml:space="preserve">-параметров для тяжелоионной структуры. Ввиду </w:t>
+      </w:r>
+      <w:proofErr w:type="spellStart"/>
+      <w:r>
+        <w:rPr>
+          <w:rFonts w:ascii="Times New Roman" w:hAnsi="Times New Roman" w:cs="Times New Roman"/>
+        </w:rPr>
+        <w:t>неоптимальности</w:t>
+      </w:r>
+      <w:proofErr w:type="spellEnd"/>
+      <w:r>
+        <w:rPr>
+          <w:rFonts w:ascii="Times New Roman" w:hAnsi="Times New Roman" w:cs="Times New Roman"/>
+        </w:rPr>
+        <w:t xml:space="preserve"> выбранного способа подавления дисперсии, на краях арки возникают характерные максимумы, что в конечном счёте </w:t>
       </w:r>
       <w:r>
         <w:rPr>
@@ -7247,6 +8737,7 @@
       <w:pPr>
         <w:pStyle w:val="1"/>
         <w:spacing w:line="360" w:lineRule="auto"/>
+        <w:jc w:val="both"/>
         <w:rPr>
           <w:rFonts w:ascii="Times New Roman" w:hAnsi="Times New Roman" w:cs="Times New Roman"/>
         </w:rPr>
@@ -7261,6 +8752,7 @@
     <w:p>
       <w:pPr>
         <w:spacing w:line="360" w:lineRule="auto"/>
+        <w:jc w:val="both"/>
         <w:rPr>
           <w:rFonts w:ascii="Times New Roman" w:hAnsi="Times New Roman" w:cs="Times New Roman"/>
         </w:rPr>
@@ -7271,12 +8763,70 @@
         </w:rPr>
         <w:tab/>
         <w:t>Рассмотрены особенности магнитооптической структуры кольца в форме 8.</w:t>
+      </w:r>
+      <w:r>
+        <w:rPr>
+          <w:rFonts w:ascii="Times New Roman" w:hAnsi="Times New Roman" w:cs="Times New Roman"/>
+        </w:rPr>
+        <w:t xml:space="preserve"> Показана возможность</w:t>
+      </w:r>
+      <w:r>
+        <w:rPr>
+          <w:rFonts w:ascii="Times New Roman" w:hAnsi="Times New Roman" w:cs="Times New Roman"/>
+        </w:rPr>
+        <w:t xml:space="preserve"> использования кольца для решения различных физических программ. Для протонного поляризованного пучка предложен метод резонансного поднятия критической энергии. Для накопления ЭДМ-сигнала в структуре с квази-замороженным спином </w:t>
+      </w:r>
+      <w:r>
+        <w:rPr>
+          <w:rFonts w:ascii="Times New Roman" w:hAnsi="Times New Roman" w:cs="Times New Roman"/>
+        </w:rPr>
+        <w:t>реализована возможность расстановки 3-х независимых семейств секступолей для коррекции равновесного уровня энергии. Для тяжелоионного пучка проведен</w:t>
+      </w:r>
+      <w:r>
+        <w:rPr>
+          <w:rFonts w:ascii="Times New Roman" w:hAnsi="Times New Roman" w:cs="Times New Roman"/>
+        </w:rPr>
+        <w:t>а</w:t>
+      </w:r>
+      <w:r>
+        <w:rPr>
+          <w:rFonts w:ascii="Times New Roman" w:hAnsi="Times New Roman" w:cs="Times New Roman"/>
+        </w:rPr>
+        <w:t xml:space="preserve"> </w:t>
+      </w:r>
+      <w:r>
+        <w:rPr>
+          <w:rFonts w:ascii="Times New Roman" w:hAnsi="Times New Roman" w:cs="Times New Roman"/>
+        </w:rPr>
+        <w:t>оптимизация</w:t>
+      </w:r>
+      <w:r>
+        <w:rPr>
+          <w:rFonts w:ascii="Times New Roman" w:hAnsi="Times New Roman" w:cs="Times New Roman"/>
+        </w:rPr>
+        <w:t xml:space="preserve"> времени внутрипучкового рассеяния.</w:t>
+      </w:r>
+    </w:p>
+    <w:p>
+      <w:pPr>
+        <w:spacing w:line="360" w:lineRule="auto"/>
+        <w:jc w:val="both"/>
+        <w:rPr>
+          <w:rFonts w:ascii="Times New Roman" w:hAnsi="Times New Roman" w:cs="Times New Roman"/>
+        </w:rPr>
+      </w:pPr>
+      <w:r>
+        <w:rPr>
+          <w:rFonts w:ascii="Times New Roman" w:hAnsi="Times New Roman" w:cs="Times New Roman"/>
+        </w:rPr>
+        <w:t>Приведенные возможности применения кольца, а также особые свойства для поляризованных пучков делают такую установку уникальной.</w:t>
       </w:r>
     </w:p>
     <w:p>
       <w:pPr>
         <w:pStyle w:val="1"/>
         <w:spacing w:line="360" w:lineRule="auto"/>
+        <w:jc w:val="both"/>
         <w:rPr>
           <w:rFonts w:ascii="Times New Roman" w:hAnsi="Times New Roman" w:cs="Times New Roman"/>
         </w:rPr>
@@ -7291,6 +8841,7 @@
     <w:p>
       <w:pPr>
         <w:spacing w:line="360" w:lineRule="auto"/>
+        <w:jc w:val="both"/>
         <w:rPr>
           <w:rFonts w:ascii="Times New Roman" w:hAnsi="Times New Roman" w:cs="Times New Roman"/>
         </w:rPr>
@@ -7305,60 +8856,23 @@
     </w:p>
     <w:p>
       <w:pPr>
-        <w:pStyle w:val="Default"/>
-        <w:spacing w:line="360" w:lineRule="auto"/>
-        <w:jc w:val="both"/>
+        <w:pStyle w:val="1"/>
+        <w:rPr>
+          <w:rFonts w:ascii="Times New Roman" w:hAnsi="Times New Roman" w:cs="Times New Roman"/>
+        </w:rPr>
       </w:pPr>
       <w:r>
-        <w:tab/>
-      </w:r>
-    </w:p>
-    <w:p>
-      <w:pPr>
-        <w:spacing w:line="360" w:lineRule="auto"/>
-        <w:rPr>
-          <w:rFonts w:ascii="Times New Roman" w:hAnsi="Times New Roman" w:cs="Times New Roman"/>
-        </w:rPr>
-      </w:pPr>
-    </w:p>
-    <w:p>
-      <w:pPr>
-        <w:pStyle w:val="Default"/>
-        <w:spacing w:line="360" w:lineRule="auto"/>
-        <w:jc w:val="both"/>
-      </w:pPr>
+        <w:rPr>
+          <w:rFonts w:ascii="Times New Roman" w:hAnsi="Times New Roman" w:cs="Times New Roman"/>
+        </w:rPr>
+        <w:t>Список литературы</w:t>
+      </w:r>
     </w:p>
     <w:p>
       <w:pPr>
         <w:pStyle w:val="Body"/>
         <w:spacing w:line="360" w:lineRule="auto"/>
-        <w:jc w:val="center"/>
-        <w:rPr>
-          <w:rFonts w:ascii="Times New Roman" w:hAnsi="Times New Roman" w:cs="Times New Roman"/>
-          <w:b/>
-          <w:bCs/>
-          <w:sz w:val="24"/>
-          <w:szCs w:val="24"/>
-          <w:lang w:val="ru-RU"/>
-        </w:rPr>
-      </w:pPr>
-      <w:r>
-        <w:rPr>
-          <w:rFonts w:ascii="Times New Roman" w:hAnsi="Times New Roman" w:cs="Times New Roman"/>
-          <w:b/>
-          <w:bCs/>
-          <w:sz w:val="24"/>
-          <w:szCs w:val="24"/>
-          <w:lang w:val="ru-RU"/>
-        </w:rPr>
-        <w:t>Список литературы</w:t>
-      </w:r>
-    </w:p>
-    <w:p>
-      <w:pPr>
-        <w:pStyle w:val="Body"/>
-        <w:spacing w:line="360" w:lineRule="auto"/>
-        <w:jc w:val="center"/>
+        <w:jc w:val="both"/>
         <w:rPr>
           <w:rFonts w:ascii="Times New Roman" w:hAnsi="Times New Roman" w:cs="Times New Roman"/>
           <w:b/>
@@ -7388,6 +8902,7 @@
           <w14:ligatures w14:val="none"/>
         </w:rPr>
       </w:pPr>
+      <w:proofErr w:type="spellStart"/>
       <w:r>
         <w:rPr>
           <w:rFonts w:ascii="Times New Roman" w:eastAsia="Times New Roman" w:hAnsi="Times New Roman" w:cs="Times New Roman"/>
@@ -7397,7 +8912,68 @@
           <w:lang w:val="en-US" w:eastAsia="ru-RU"/>
           <w14:ligatures w14:val="none"/>
         </w:rPr>
-        <w:t>Ya. S. Derbenev et al. Polarization Preservation and Control in a Figure-8 Ring, Int.J.Mod.Phys.Conf.Ser. 40 (2016) 01, 166009 DOI: 10.1142/S2010194516600909</w:t>
+        <w:lastRenderedPageBreak/>
+        <w:t>Ya</w:t>
+      </w:r>
+      <w:proofErr w:type="spellEnd"/>
+      <w:r>
+        <w:rPr>
+          <w:rFonts w:ascii="Times New Roman" w:eastAsia="Times New Roman" w:hAnsi="Times New Roman" w:cs="Times New Roman"/>
+          <w:kern w:val="0"/>
+          <w:sz w:val="24"/>
+          <w:szCs w:val="24"/>
+          <w:lang w:val="en-US" w:eastAsia="ru-RU"/>
+          <w14:ligatures w14:val="none"/>
+        </w:rPr>
+        <w:t xml:space="preserve">. S. </w:t>
+      </w:r>
+      <w:proofErr w:type="spellStart"/>
+      <w:r>
+        <w:rPr>
+          <w:rFonts w:ascii="Times New Roman" w:eastAsia="Times New Roman" w:hAnsi="Times New Roman" w:cs="Times New Roman"/>
+          <w:kern w:val="0"/>
+          <w:sz w:val="24"/>
+          <w:szCs w:val="24"/>
+          <w:lang w:val="en-US" w:eastAsia="ru-RU"/>
+          <w14:ligatures w14:val="none"/>
+        </w:rPr>
+        <w:t>Derbenev</w:t>
+      </w:r>
+      <w:proofErr w:type="spellEnd"/>
+      <w:r>
+        <w:rPr>
+          <w:rFonts w:ascii="Times New Roman" w:eastAsia="Times New Roman" w:hAnsi="Times New Roman" w:cs="Times New Roman"/>
+          <w:kern w:val="0"/>
+          <w:sz w:val="24"/>
+          <w:szCs w:val="24"/>
+          <w:lang w:val="en-US" w:eastAsia="ru-RU"/>
+          <w14:ligatures w14:val="none"/>
+        </w:rPr>
+        <w:t xml:space="preserve"> et al. Polarization Preservation and Control in a Figure-8 Ring, </w:t>
+      </w:r>
+      <w:proofErr w:type="spellStart"/>
+      <w:r>
+        <w:rPr>
+          <w:rFonts w:ascii="Times New Roman" w:eastAsia="Times New Roman" w:hAnsi="Times New Roman" w:cs="Times New Roman"/>
+          <w:kern w:val="0"/>
+          <w:sz w:val="24"/>
+          <w:szCs w:val="24"/>
+          <w:lang w:val="en-US" w:eastAsia="ru-RU"/>
+          <w14:ligatures w14:val="none"/>
+        </w:rPr>
+        <w:t>Int.J.Mod.Phys.Conf.Ser</w:t>
+      </w:r>
+      <w:proofErr w:type="spellEnd"/>
+      <w:r>
+        <w:rPr>
+          <w:rFonts w:ascii="Times New Roman" w:eastAsia="Times New Roman" w:hAnsi="Times New Roman" w:cs="Times New Roman"/>
+          <w:kern w:val="0"/>
+          <w:sz w:val="24"/>
+          <w:szCs w:val="24"/>
+          <w:lang w:val="en-US" w:eastAsia="ru-RU"/>
+          <w14:ligatures w14:val="none"/>
+        </w:rPr>
+        <w:t>. 40 (2016) 01, 166009 DOI: 10.1142/S2010194516600909</w:t>
       </w:r>
     </w:p>
     <w:p>
@@ -7428,7 +9004,55 @@
           <w:lang w:val="en-US" w:eastAsia="ru-RU"/>
           <w14:ligatures w14:val="none"/>
         </w:rPr>
-        <w:t>Senichev, Y.V., Chechenin, A.N. Theory of “Resonant” lattices for synchrotrons with negative momentum compaction factor. J. Exp. Theor. Phys. 105, 988–997 (2007). DOI: 10.1134/S1063776107110118</w:t>
+        <w:t xml:space="preserve">Senichev, Y.V., </w:t>
+      </w:r>
+      <w:proofErr w:type="spellStart"/>
+      <w:r>
+        <w:rPr>
+          <w:rFonts w:ascii="Times New Roman" w:eastAsia="Times New Roman" w:hAnsi="Times New Roman" w:cs="Times New Roman"/>
+          <w:kern w:val="0"/>
+          <w:sz w:val="24"/>
+          <w:szCs w:val="24"/>
+          <w:lang w:val="en-US" w:eastAsia="ru-RU"/>
+          <w14:ligatures w14:val="none"/>
+        </w:rPr>
+        <w:t>Chechenin</w:t>
+      </w:r>
+      <w:proofErr w:type="spellEnd"/>
+      <w:r>
+        <w:rPr>
+          <w:rFonts w:ascii="Times New Roman" w:eastAsia="Times New Roman" w:hAnsi="Times New Roman" w:cs="Times New Roman"/>
+          <w:kern w:val="0"/>
+          <w:sz w:val="24"/>
+          <w:szCs w:val="24"/>
+          <w:lang w:val="en-US" w:eastAsia="ru-RU"/>
+          <w14:ligatures w14:val="none"/>
+        </w:rPr>
+        <w:t xml:space="preserve">, A.N. Theory of “Resonant” lattices for synchrotrons with negative momentum compaction factor. J. Exp. </w:t>
+      </w:r>
+      <w:proofErr w:type="spellStart"/>
+      <w:r>
+        <w:rPr>
+          <w:rFonts w:ascii="Times New Roman" w:eastAsia="Times New Roman" w:hAnsi="Times New Roman" w:cs="Times New Roman"/>
+          <w:kern w:val="0"/>
+          <w:sz w:val="24"/>
+          <w:szCs w:val="24"/>
+          <w:lang w:val="en-US" w:eastAsia="ru-RU"/>
+          <w14:ligatures w14:val="none"/>
+        </w:rPr>
+        <w:t>Theor</w:t>
+      </w:r>
+      <w:proofErr w:type="spellEnd"/>
+      <w:r>
+        <w:rPr>
+          <w:rFonts w:ascii="Times New Roman" w:eastAsia="Times New Roman" w:hAnsi="Times New Roman" w:cs="Times New Roman"/>
+          <w:kern w:val="0"/>
+          <w:sz w:val="24"/>
+          <w:szCs w:val="24"/>
+          <w:lang w:val="en-US" w:eastAsia="ru-RU"/>
+          <w14:ligatures w14:val="none"/>
+        </w:rPr>
+        <w:t>. Phys. 105, 988–997 (2007). DOI: 10.1134/S1063776107110118</w:t>
       </w:r>
     </w:p>
     <w:p>
@@ -7450,6 +9074,8 @@
           <w14:ligatures w14:val="none"/>
         </w:rPr>
       </w:pPr>
+      <w:proofErr w:type="spellStart"/>
+      <w:proofErr w:type="gramStart"/>
       <w:r>
         <w:rPr>
           <w:rFonts w:ascii="Times New Roman" w:eastAsia="Times New Roman" w:hAnsi="Times New Roman" w:cs="Times New Roman"/>
@@ -7459,8 +9085,130 @@
           <w:lang w:val="en-US" w:eastAsia="ru-RU"/>
           <w14:ligatures w14:val="none"/>
         </w:rPr>
-        <w:t>Yu.Senichev et al., in ICAP2015 Proccedings, Shanghai, 2016, ed. by C.Kwok, R.W.Volker, T.Chuanxiang, Y.Heping</w:t>
-      </w:r>
+        <w:t>Yu.Senichev</w:t>
+      </w:r>
+      <w:proofErr w:type="spellEnd"/>
+      <w:proofErr w:type="gramEnd"/>
+      <w:r>
+        <w:rPr>
+          <w:rFonts w:ascii="Times New Roman" w:eastAsia="Times New Roman" w:hAnsi="Times New Roman" w:cs="Times New Roman"/>
+          <w:kern w:val="0"/>
+          <w:sz w:val="24"/>
+          <w:szCs w:val="24"/>
+          <w:lang w:val="en-US" w:eastAsia="ru-RU"/>
+          <w14:ligatures w14:val="none"/>
+        </w:rPr>
+        <w:t xml:space="preserve"> et al., in ICAP2015 </w:t>
+      </w:r>
+      <w:proofErr w:type="spellStart"/>
+      <w:r>
+        <w:rPr>
+          <w:rFonts w:ascii="Times New Roman" w:eastAsia="Times New Roman" w:hAnsi="Times New Roman" w:cs="Times New Roman"/>
+          <w:kern w:val="0"/>
+          <w:sz w:val="24"/>
+          <w:szCs w:val="24"/>
+          <w:lang w:val="en-US" w:eastAsia="ru-RU"/>
+          <w14:ligatures w14:val="none"/>
+        </w:rPr>
+        <w:t>Proccedings</w:t>
+      </w:r>
+      <w:proofErr w:type="spellEnd"/>
+      <w:r>
+        <w:rPr>
+          <w:rFonts w:ascii="Times New Roman" w:eastAsia="Times New Roman" w:hAnsi="Times New Roman" w:cs="Times New Roman"/>
+          <w:kern w:val="0"/>
+          <w:sz w:val="24"/>
+          <w:szCs w:val="24"/>
+          <w:lang w:val="en-US" w:eastAsia="ru-RU"/>
+          <w14:ligatures w14:val="none"/>
+        </w:rPr>
+        <w:t xml:space="preserve">, Shanghai, 2016, ed. by </w:t>
+      </w:r>
+      <w:proofErr w:type="spellStart"/>
+      <w:r>
+        <w:rPr>
+          <w:rFonts w:ascii="Times New Roman" w:eastAsia="Times New Roman" w:hAnsi="Times New Roman" w:cs="Times New Roman"/>
+          <w:kern w:val="0"/>
+          <w:sz w:val="24"/>
+          <w:szCs w:val="24"/>
+          <w:lang w:val="en-US" w:eastAsia="ru-RU"/>
+          <w14:ligatures w14:val="none"/>
+        </w:rPr>
+        <w:t>C.Kwok</w:t>
+      </w:r>
+      <w:proofErr w:type="spellEnd"/>
+      <w:r>
+        <w:rPr>
+          <w:rFonts w:ascii="Times New Roman" w:eastAsia="Times New Roman" w:hAnsi="Times New Roman" w:cs="Times New Roman"/>
+          <w:kern w:val="0"/>
+          <w:sz w:val="24"/>
+          <w:szCs w:val="24"/>
+          <w:lang w:val="en-US" w:eastAsia="ru-RU"/>
+          <w14:ligatures w14:val="none"/>
+        </w:rPr>
+        <w:t xml:space="preserve">, </w:t>
+      </w:r>
+      <w:proofErr w:type="spellStart"/>
+      <w:r>
+        <w:rPr>
+          <w:rFonts w:ascii="Times New Roman" w:eastAsia="Times New Roman" w:hAnsi="Times New Roman" w:cs="Times New Roman"/>
+          <w:kern w:val="0"/>
+          <w:sz w:val="24"/>
+          <w:szCs w:val="24"/>
+          <w:lang w:val="en-US" w:eastAsia="ru-RU"/>
+          <w14:ligatures w14:val="none"/>
+        </w:rPr>
+        <w:t>R.W.Volker</w:t>
+      </w:r>
+      <w:proofErr w:type="spellEnd"/>
+      <w:r>
+        <w:rPr>
+          <w:rFonts w:ascii="Times New Roman" w:eastAsia="Times New Roman" w:hAnsi="Times New Roman" w:cs="Times New Roman"/>
+          <w:kern w:val="0"/>
+          <w:sz w:val="24"/>
+          <w:szCs w:val="24"/>
+          <w:lang w:val="en-US" w:eastAsia="ru-RU"/>
+          <w14:ligatures w14:val="none"/>
+        </w:rPr>
+        <w:t xml:space="preserve">, </w:t>
+      </w:r>
+      <w:proofErr w:type="spellStart"/>
+      <w:r>
+        <w:rPr>
+          <w:rFonts w:ascii="Times New Roman" w:eastAsia="Times New Roman" w:hAnsi="Times New Roman" w:cs="Times New Roman"/>
+          <w:kern w:val="0"/>
+          <w:sz w:val="24"/>
+          <w:szCs w:val="24"/>
+          <w:lang w:val="en-US" w:eastAsia="ru-RU"/>
+          <w14:ligatures w14:val="none"/>
+        </w:rPr>
+        <w:t>T.Chuanxiang</w:t>
+      </w:r>
+      <w:proofErr w:type="spellEnd"/>
+      <w:r>
+        <w:rPr>
+          <w:rFonts w:ascii="Times New Roman" w:eastAsia="Times New Roman" w:hAnsi="Times New Roman" w:cs="Times New Roman"/>
+          <w:kern w:val="0"/>
+          <w:sz w:val="24"/>
+          <w:szCs w:val="24"/>
+          <w:lang w:val="en-US" w:eastAsia="ru-RU"/>
+          <w14:ligatures w14:val="none"/>
+        </w:rPr>
+        <w:t xml:space="preserve">, </w:t>
+      </w:r>
+      <w:proofErr w:type="spellStart"/>
+      <w:r>
+        <w:rPr>
+          <w:rFonts w:ascii="Times New Roman" w:eastAsia="Times New Roman" w:hAnsi="Times New Roman" w:cs="Times New Roman"/>
+          <w:kern w:val="0"/>
+          <w:sz w:val="24"/>
+          <w:szCs w:val="24"/>
+          <w:lang w:val="en-US" w:eastAsia="ru-RU"/>
+          <w14:ligatures w14:val="none"/>
+        </w:rPr>
+        <w:t>Y.Heping</w:t>
+      </w:r>
+      <w:proofErr w:type="spellEnd"/>
     </w:p>
     <w:p>
       <w:pPr>
@@ -7481,6 +9229,7 @@
           <w14:ligatures w14:val="none"/>
         </w:rPr>
       </w:pPr>
+      <w:proofErr w:type="spellStart"/>
       <w:r>
         <w:rPr>
           <w:rFonts w:ascii="Times New Roman" w:eastAsia="Times New Roman" w:hAnsi="Times New Roman" w:cs="Times New Roman"/>
@@ -7490,13 +9239,10 @@
           <w:lang w:val="en-US" w:eastAsia="ru-RU"/>
           <w14:ligatures w14:val="none"/>
         </w:rPr>
-        <w:t>N.N.Nikolaev, Spin of protons in NICA and PTR storage rings as an axion antenna. Jetp Lett. 115, 639–643 (2022). DOI: 10.1134/S0021364022600653</w:t>
-      </w:r>
-    </w:p>
-    <w:p>
-      <w:pPr>
-        <w:spacing w:line="360" w:lineRule="auto"/>
-        <w:jc w:val="both"/>
+        <w:t>N.</w:t>
+      </w:r>
+      <w:proofErr w:type="gramStart"/>
+      <w:r>
         <w:rPr>
           <w:rFonts w:ascii="Times New Roman" w:eastAsia="Times New Roman" w:hAnsi="Times New Roman" w:cs="Times New Roman"/>
           <w:kern w:val="0"/>
@@ -7505,13 +9251,81 @@
           <w:lang w:val="en-US" w:eastAsia="ru-RU"/>
           <w14:ligatures w14:val="none"/>
         </w:rPr>
+        <w:t>N.Nikolaev</w:t>
+      </w:r>
+      <w:proofErr w:type="spellEnd"/>
+      <w:proofErr w:type="gramEnd"/>
+      <w:r>
+        <w:rPr>
+          <w:rFonts w:ascii="Times New Roman" w:eastAsia="Times New Roman" w:hAnsi="Times New Roman" w:cs="Times New Roman"/>
+          <w:kern w:val="0"/>
+          <w:sz w:val="24"/>
+          <w:szCs w:val="24"/>
+          <w:lang w:val="en-US" w:eastAsia="ru-RU"/>
+          <w14:ligatures w14:val="none"/>
+        </w:rPr>
+        <w:t xml:space="preserve">, Spin of protons in NICA and PTR storage rings as an axion antenna. </w:t>
+      </w:r>
+      <w:proofErr w:type="spellStart"/>
+      <w:r>
+        <w:rPr>
+          <w:rFonts w:ascii="Times New Roman" w:eastAsia="Times New Roman" w:hAnsi="Times New Roman" w:cs="Times New Roman"/>
+          <w:kern w:val="0"/>
+          <w:sz w:val="24"/>
+          <w:szCs w:val="24"/>
+          <w:lang w:val="en-US" w:eastAsia="ru-RU"/>
+          <w14:ligatures w14:val="none"/>
+        </w:rPr>
+        <w:t>Jetp</w:t>
+      </w:r>
+      <w:proofErr w:type="spellEnd"/>
+      <w:r>
+        <w:rPr>
+          <w:rFonts w:ascii="Times New Roman" w:eastAsia="Times New Roman" w:hAnsi="Times New Roman" w:cs="Times New Roman"/>
+          <w:kern w:val="0"/>
+          <w:sz w:val="24"/>
+          <w:szCs w:val="24"/>
+          <w:lang w:val="en-US" w:eastAsia="ru-RU"/>
+          <w14:ligatures w14:val="none"/>
+        </w:rPr>
+        <w:t xml:space="preserve"> Lett. 115, 639–643 (2022). DOI: 10.1134/S0021364022600653</w:t>
+      </w:r>
+    </w:p>
+    <w:p>
+      <w:pPr>
+        <w:spacing w:line="360" w:lineRule="auto"/>
+        <w:jc w:val="both"/>
+        <w:rPr>
+          <w:rFonts w:ascii="Times New Roman" w:eastAsia="Times New Roman" w:hAnsi="Times New Roman" w:cs="Times New Roman"/>
+          <w:kern w:val="0"/>
+          <w:sz w:val="24"/>
+          <w:szCs w:val="24"/>
+          <w:lang w:val="en-US" w:eastAsia="ru-RU"/>
+          <w14:ligatures w14:val="none"/>
+        </w:rPr>
       </w:pPr>
       <w:r>
         <w:rPr>
           <w:rFonts w:ascii="Times New Roman" w:hAnsi="Times New Roman" w:cs="Times New Roman"/>
           <w:lang w:val="en-US"/>
         </w:rPr>
-        <w:t>Bruno Autin DISPERSION SUPPRESSION WITH MISSING MAGNETS IN A FODO STRUCTURE APPLICATION TO THE CERN ANTIPROTON ACCUMULATOR</w:t>
+        <w:t xml:space="preserve">Bruno </w:t>
+      </w:r>
+      <w:proofErr w:type="spellStart"/>
+      <w:r>
+        <w:rPr>
+          <w:rFonts w:ascii="Times New Roman" w:hAnsi="Times New Roman" w:cs="Times New Roman"/>
+          <w:lang w:val="en-US"/>
+        </w:rPr>
+        <w:t>Autin</w:t>
+      </w:r>
+      <w:proofErr w:type="spellEnd"/>
+      <w:r>
+        <w:rPr>
+          <w:rFonts w:ascii="Times New Roman" w:hAnsi="Times New Roman" w:cs="Times New Roman"/>
+          <w:lang w:val="en-US"/>
+        </w:rPr>
+        <w:t xml:space="preserve"> DISPERSION SUPPRESSION WITH MISSING MAGNETS IN A FODO STRUCTURE APPLICATION TO THE CERN ANTIPROTON ACCUMULATOR</w:t>
       </w:r>
     </w:p>
     <w:sectPr>
@@ -7525,7 +9339,7 @@
 </file>
 
 <file path=word/numbering.xml><?xml version="1.0" encoding="utf-8"?>
-<w:numbering xmlns:wpc="http://schemas.microsoft.com/office/word/2010/wordprocessingCanvas" xmlns:cx="http://schemas.microsoft.com/office/drawing/2014/chartex" xmlns:cx1="http://schemas.microsoft.com/office/drawing/2015/9/8/chartex" xmlns:cx2="http://schemas.microsoft.com/office/drawing/2015/10/21/chartex" xmlns:cx3="http://schemas.microsoft.com/office/drawing/2016/5/9/chartex" xmlns:cx4="http://schemas.microsoft.com/office/drawing/2016/5/10/chartex" xmlns:cx5="http://schemas.microsoft.com/office/drawing/2016/5/11/chartex" xmlns:cx6="http://schemas.microsoft.com/office/drawing/2016/5/12/chartex" xmlns:cx7="http://schemas.microsoft.com/office/drawing/2016/5/13/chartex" xmlns:cx8="http://schemas.microsoft.com/office/drawing/2016/5/14/chartex" xmlns:mc="http://schemas.openxmlformats.org/markup-compatibility/2006" xmlns:aink="http://schemas.microsoft.com/office/drawing/2016/ink" xmlns:am3d="http://schemas.microsoft.com/office/drawing/2017/model3d" xmlns:o="urn:schemas-microsoft-com:office:office" xmlns:r="http://schemas.openxmlformats.org/officeDocument/2006/relationships" xmlns:m="http://schemas.openxmlformats.org/officeDocument/2006/math" xmlns:v="urn:schemas-microsoft-com:vml" xmlns:wp14="http://schemas.microsoft.com/office/word/2010/wordprocessingDrawing" xmlns:wp="http://schemas.openxmlformats.org/drawingml/2006/wordprocessingDrawing" xmlns:w10="urn:schemas-microsoft-com:office:word" xmlns:w="http://schemas.openxmlformats.org/wordprocessingml/2006/main" xmlns:w14="http://schemas.microsoft.com/office/word/2010/wordml" xmlns:w15="http://schemas.microsoft.com/office/word/2012/wordml" xmlns:w16cex="http://schemas.microsoft.com/office/word/2018/wordml/cex" xmlns:w16cid="http://schemas.microsoft.com/office/word/2016/wordml/cid" xmlns:w16="http://schemas.microsoft.com/office/word/2018/wordml" xmlns:w16sdtdh="http://schemas.microsoft.com/office/word/2020/wordml/sdtdatahash" xmlns:w16se="http://schemas.microsoft.com/office/word/2015/wordml/symex" xmlns:wpg="http://schemas.microsoft.com/office/word/2010/wordprocessingGroup" xmlns:wpi="http://schemas.microsoft.com/office/word/2010/wordprocessingInk" xmlns:wne="http://schemas.microsoft.com/office/word/2006/wordml" xmlns:wps="http://schemas.microsoft.com/office/word/2010/wordprocessingShape" mc:Ignorable="w14 w15 w16se w16cid w16 w16cex w16sdtdh wp14">
+<w:numbering xmlns:wpc="http://schemas.microsoft.com/office/word/2010/wordprocessingCanvas" xmlns:cx="http://schemas.microsoft.com/office/drawing/2014/chartex" xmlns:cx1="http://schemas.microsoft.com/office/drawing/2015/9/8/chartex" xmlns:cx2="http://schemas.microsoft.com/office/drawing/2015/10/21/chartex" xmlns:cx3="http://schemas.microsoft.com/office/drawing/2016/5/9/chartex" xmlns:cx4="http://schemas.microsoft.com/office/drawing/2016/5/10/chartex" xmlns:cx5="http://schemas.microsoft.com/office/drawing/2016/5/11/chartex" xmlns:cx6="http://schemas.microsoft.com/office/drawing/2016/5/12/chartex" xmlns:cx7="http://schemas.microsoft.com/office/drawing/2016/5/13/chartex" xmlns:cx8="http://schemas.microsoft.com/office/drawing/2016/5/14/chartex" xmlns:mc="http://schemas.openxmlformats.org/markup-compatibility/2006" xmlns:aink="http://schemas.microsoft.com/office/drawing/2016/ink" xmlns:am3d="http://schemas.microsoft.com/office/drawing/2017/model3d" xmlns:o="urn:schemas-microsoft-com:office:office" xmlns:oel="http://schemas.microsoft.com/office/2019/extlst" xmlns:r="http://schemas.openxmlformats.org/officeDocument/2006/relationships" xmlns:m="http://schemas.openxmlformats.org/officeDocument/2006/math" xmlns:v="urn:schemas-microsoft-com:vml" xmlns:wp14="http://schemas.microsoft.com/office/word/2010/wordprocessingDrawing" xmlns:wp="http://schemas.openxmlformats.org/drawingml/2006/wordprocessingDrawing" xmlns:w10="urn:schemas-microsoft-com:office:word" xmlns:w="http://schemas.openxmlformats.org/wordprocessingml/2006/main" xmlns:w14="http://schemas.microsoft.com/office/word/2010/wordml" xmlns:w15="http://schemas.microsoft.com/office/word/2012/wordml" xmlns:w16cex="http://schemas.microsoft.com/office/word/2018/wordml/cex" xmlns:w16cid="http://schemas.microsoft.com/office/word/2016/wordml/cid" xmlns:w16="http://schemas.microsoft.com/office/word/2018/wordml" xmlns:w16sdtdh="http://schemas.microsoft.com/office/word/2020/wordml/sdtdatahash" xmlns:w16se="http://schemas.microsoft.com/office/word/2015/wordml/symex" xmlns:wpg="http://schemas.microsoft.com/office/word/2010/wordprocessingGroup" xmlns:wpi="http://schemas.microsoft.com/office/word/2010/wordprocessingInk" xmlns:wne="http://schemas.microsoft.com/office/word/2006/wordml" xmlns:wps="http://schemas.microsoft.com/office/word/2010/wordprocessingShape" mc:Ignorable="w14 w15 w16se w16cid w16 w16cex w16sdtdh wp14">
   <w:abstractNum w:abstractNumId="0" w15:restartNumberingAfterBreak="0">
     <w:nsid w:val="1D8C37E6"/>
     <w:multiLevelType w:val="hybridMultilevel"/>
@@ -7615,7 +9429,7 @@
       </w:pPr>
     </w:lvl>
   </w:abstractNum>
-  <w:num w:numId="1">
+  <w:num w:numId="1" w16cid:durableId="13924965">
     <w:abstractNumId w:val="0"/>
   </w:num>
 </w:numbering>
@@ -8052,7 +9866,6 @@
   <w:style w:type="character" w:default="1" w:styleId="a0">
     <w:name w:val="Default Paragraph Font"/>
     <w:uiPriority w:val="1"/>
-    <w:semiHidden/>
     <w:unhideWhenUsed/>
   </w:style>
   <w:style w:type="table" w:default="1" w:styleId="a1">

</xml_diff>